<commit_message>
data structure assignments are done
</commit_message>
<xml_diff>
--- a/MYSQL/Assignments/05_Assignment.docx
+++ b/MYSQL/Assignments/05_Assignment.docx
@@ -17,6 +17,9 @@
     </w:p>
     <w:p>
       <w:r>
+        <w:rPr>
+          <w:noProof/>
+        </w:rPr>
         <w:drawing>
           <wp:inline distT="0" distB="0" distL="0" distR="0" wp14:anchorId="1C3E7FAA" wp14:editId="6E28051F">
             <wp:extent cx="5731510" cy="1504950"/>
@@ -74,6 +77,9 @@
         </w:tabs>
       </w:pPr>
       <w:r>
+        <w:rPr>
+          <w:noProof/>
+        </w:rPr>
         <w:drawing>
           <wp:inline distT="0" distB="0" distL="0" distR="0" wp14:anchorId="6833BD92" wp14:editId="60AF11DA">
             <wp:extent cx="5731510" cy="1811020"/>
@@ -131,9 +137,12 @@
     </w:p>
     <w:p>
       <w:r>
+        <w:rPr>
+          <w:noProof/>
+        </w:rPr>
         <w:drawing>
-          <wp:inline distT="0" distB="0" distL="0" distR="0" wp14:anchorId="09C375ED" wp14:editId="30DE012A">
-            <wp:extent cx="5731510" cy="1981200"/>
+          <wp:inline distT="0" distB="0" distL="0" distR="0" wp14:anchorId="09C375ED" wp14:editId="3BEFF675">
+            <wp:extent cx="5731510" cy="1701800"/>
             <wp:effectExtent l="0" t="0" r="2540" b="0"/>
             <wp:docPr id="3" name="Picture 3"/>
             <wp:cNvGraphicFramePr>
@@ -155,7 +164,7 @@
                   <pic:spPr>
                     <a:xfrm>
                       <a:off x="0" y="0"/>
-                      <a:ext cx="5731510" cy="1981200"/>
+                      <a:ext cx="5731510" cy="1701800"/>
                     </a:xfrm>
                     <a:prstGeom prst="rect">
                       <a:avLst/>
@@ -170,495 +179,1275 @@
       <w:r>
         <w:t xml:space="preserve"> </w:t>
       </w:r>
+    </w:p>
+    <w:p>
+      <w:r>
+        <w:t>Q4) Write an SQL query to display issue details of books issued for more than 30 days.</w:t>
+      </w:r>
+    </w:p>
+    <w:p>
+      <w:r>
+        <w:drawing>
+          <wp:inline distT="0" distB="0" distL="0" distR="0" wp14:anchorId="33018D46" wp14:editId="1B9B7F5A">
+            <wp:extent cx="5731510" cy="1873250"/>
+            <wp:effectExtent l="0" t="0" r="2540" b="0"/>
+            <wp:docPr id="4" name="Picture 4"/>
+            <wp:cNvGraphicFramePr>
+              <a:graphicFrameLocks xmlns:a="http://schemas.openxmlformats.org/drawingml/2006/main" noChangeAspect="1"/>
+            </wp:cNvGraphicFramePr>
+            <a:graphic xmlns:a="http://schemas.openxmlformats.org/drawingml/2006/main">
+              <a:graphicData uri="http://schemas.openxmlformats.org/drawingml/2006/picture">
+                <pic:pic xmlns:pic="http://schemas.openxmlformats.org/drawingml/2006/picture">
+                  <pic:nvPicPr>
+                    <pic:cNvPr id="1" name=""/>
+                    <pic:cNvPicPr/>
+                  </pic:nvPicPr>
+                  <pic:blipFill>
+                    <a:blip r:embed="rId7"/>
+                    <a:stretch>
+                      <a:fillRect/>
+                    </a:stretch>
+                  </pic:blipFill>
+                  <pic:spPr>
+                    <a:xfrm>
+                      <a:off x="0" y="0"/>
+                      <a:ext cx="5731510" cy="1873250"/>
+                    </a:xfrm>
+                    <a:prstGeom prst="rect">
+                      <a:avLst/>
+                    </a:prstGeom>
+                  </pic:spPr>
+                </pic:pic>
+              </a:graphicData>
+            </a:graphic>
+          </wp:inline>
+        </w:drawing>
+      </w:r>
+    </w:p>
+    <w:p>
+      <w:r>
+        <w:lastRenderedPageBreak/>
+        <w:t>Q5) Write an SQL query to list all books priced between 500 and 750 and belonging to category</w:t>
+      </w:r>
+    </w:p>
+    <w:p>
+      <w:r>
+        <w:t>RDBMS</w:t>
+      </w:r>
+      <w:r>
+        <w:t>.</w:t>
+      </w:r>
+    </w:p>
+    <w:p>
+      <w:r>
+        <w:drawing>
+          <wp:inline distT="0" distB="0" distL="0" distR="0" wp14:anchorId="2DA581C1" wp14:editId="49F68F0B">
+            <wp:extent cx="5731510" cy="1547446"/>
+            <wp:effectExtent l="0" t="0" r="2540" b="0"/>
+            <wp:docPr id="5" name="Picture 5"/>
+            <wp:cNvGraphicFramePr>
+              <a:graphicFrameLocks xmlns:a="http://schemas.openxmlformats.org/drawingml/2006/main" noChangeAspect="1"/>
+            </wp:cNvGraphicFramePr>
+            <a:graphic xmlns:a="http://schemas.openxmlformats.org/drawingml/2006/main">
+              <a:graphicData uri="http://schemas.openxmlformats.org/drawingml/2006/picture">
+                <pic:pic xmlns:pic="http://schemas.openxmlformats.org/drawingml/2006/picture">
+                  <pic:nvPicPr>
+                    <pic:cNvPr id="1" name=""/>
+                    <pic:cNvPicPr/>
+                  </pic:nvPicPr>
+                  <pic:blipFill>
+                    <a:blip r:embed="rId8"/>
+                    <a:stretch>
+                      <a:fillRect/>
+                    </a:stretch>
+                  </pic:blipFill>
+                  <pic:spPr>
+                    <a:xfrm>
+                      <a:off x="0" y="0"/>
+                      <a:ext cx="5737779" cy="1549139"/>
+                    </a:xfrm>
+                    <a:prstGeom prst="rect">
+                      <a:avLst/>
+                    </a:prstGeom>
+                  </pic:spPr>
+                </pic:pic>
+              </a:graphicData>
+            </a:graphic>
+          </wp:inline>
+        </w:drawing>
+      </w:r>
+    </w:p>
+    <w:p>
+      <w:r>
+        <w:t>Q6) Write an SQL query to list all books belonging to categories Science, Database, Fiction, or</w:t>
+      </w:r>
+    </w:p>
+    <w:p>
+      <w:r>
+        <w:t>Management.</w:t>
+      </w:r>
+    </w:p>
+    <w:p>
+      <w:r>
+        <w:drawing>
+          <wp:inline distT="0" distB="0" distL="0" distR="0" wp14:anchorId="2D2BF08B" wp14:editId="36DA2E95">
+            <wp:extent cx="5731510" cy="1448973"/>
+            <wp:effectExtent l="0" t="0" r="2540" b="0"/>
+            <wp:docPr id="6" name="Picture 6"/>
+            <wp:cNvGraphicFramePr>
+              <a:graphicFrameLocks xmlns:a="http://schemas.openxmlformats.org/drawingml/2006/main" noChangeAspect="1"/>
+            </wp:cNvGraphicFramePr>
+            <a:graphic xmlns:a="http://schemas.openxmlformats.org/drawingml/2006/main">
+              <a:graphicData uri="http://schemas.openxmlformats.org/drawingml/2006/picture">
+                <pic:pic xmlns:pic="http://schemas.openxmlformats.org/drawingml/2006/picture">
+                  <pic:nvPicPr>
+                    <pic:cNvPr id="1" name=""/>
+                    <pic:cNvPicPr/>
+                  </pic:nvPicPr>
+                  <pic:blipFill>
+                    <a:blip r:embed="rId9"/>
+                    <a:stretch>
+                      <a:fillRect/>
+                    </a:stretch>
+                  </pic:blipFill>
+                  <pic:spPr>
+                    <a:xfrm>
+                      <a:off x="0" y="0"/>
+                      <a:ext cx="5736793" cy="1450308"/>
+                    </a:xfrm>
+                    <a:prstGeom prst="rect">
+                      <a:avLst/>
+                    </a:prstGeom>
+                  </pic:spPr>
+                </pic:pic>
+              </a:graphicData>
+            </a:graphic>
+          </wp:inline>
+        </w:drawing>
+      </w:r>
+    </w:p>
+    <w:p>
+      <w:r>
+        <w:t>Q7) Write an SQL query to list all members in descending order of penalty amount.</w:t>
+      </w:r>
+    </w:p>
+    <w:p>
+      <w:r>
+        <w:drawing>
+          <wp:inline distT="0" distB="0" distL="0" distR="0" wp14:anchorId="5CACFBFA" wp14:editId="3E64165D">
+            <wp:extent cx="5731510" cy="1667022"/>
+            <wp:effectExtent l="0" t="0" r="2540" b="9525"/>
+            <wp:docPr id="7" name="Picture 7"/>
+            <wp:cNvGraphicFramePr>
+              <a:graphicFrameLocks xmlns:a="http://schemas.openxmlformats.org/drawingml/2006/main" noChangeAspect="1"/>
+            </wp:cNvGraphicFramePr>
+            <a:graphic xmlns:a="http://schemas.openxmlformats.org/drawingml/2006/main">
+              <a:graphicData uri="http://schemas.openxmlformats.org/drawingml/2006/picture">
+                <pic:pic xmlns:pic="http://schemas.openxmlformats.org/drawingml/2006/picture">
+                  <pic:nvPicPr>
+                    <pic:cNvPr id="1" name=""/>
+                    <pic:cNvPicPr/>
+                  </pic:nvPicPr>
+                  <pic:blipFill>
+                    <a:blip r:embed="rId10"/>
+                    <a:stretch>
+                      <a:fillRect/>
+                    </a:stretch>
+                  </pic:blipFill>
+                  <pic:spPr>
+                    <a:xfrm>
+                      <a:off x="0" y="0"/>
+                      <a:ext cx="5743613" cy="1670542"/>
+                    </a:xfrm>
+                    <a:prstGeom prst="rect">
+                      <a:avLst/>
+                    </a:prstGeom>
+                  </pic:spPr>
+                </pic:pic>
+              </a:graphicData>
+            </a:graphic>
+          </wp:inline>
+        </w:drawing>
+      </w:r>
+    </w:p>
+    <w:p>
+      <w:r>
+        <w:t>Q8) Write an SQL query to update book number 103 with cost = 300 and category = 'RDBMS'.</w:t>
+      </w:r>
+    </w:p>
+    <w:p>
+      <w:r>
+        <w:drawing>
+          <wp:inline distT="0" distB="0" distL="0" distR="0" wp14:anchorId="7B1B9AB8" wp14:editId="232ECC12">
+            <wp:extent cx="5730092" cy="2089052"/>
+            <wp:effectExtent l="0" t="0" r="4445" b="6985"/>
+            <wp:docPr id="8" name="Picture 8"/>
+            <wp:cNvGraphicFramePr>
+              <a:graphicFrameLocks xmlns:a="http://schemas.openxmlformats.org/drawingml/2006/main" noChangeAspect="1"/>
+            </wp:cNvGraphicFramePr>
+            <a:graphic xmlns:a="http://schemas.openxmlformats.org/drawingml/2006/main">
+              <a:graphicData uri="http://schemas.openxmlformats.org/drawingml/2006/picture">
+                <pic:pic xmlns:pic="http://schemas.openxmlformats.org/drawingml/2006/picture">
+                  <pic:nvPicPr>
+                    <pic:cNvPr id="1" name=""/>
+                    <pic:cNvPicPr/>
+                  </pic:nvPicPr>
+                  <pic:blipFill>
+                    <a:blip r:embed="rId11"/>
+                    <a:stretch>
+                      <a:fillRect/>
+                    </a:stretch>
+                  </pic:blipFill>
+                  <pic:spPr>
+                    <a:xfrm>
+                      <a:off x="0" y="0"/>
+                      <a:ext cx="5745187" cy="2094555"/>
+                    </a:xfrm>
+                    <a:prstGeom prst="rect">
+                      <a:avLst/>
+                    </a:prstGeom>
+                  </pic:spPr>
+                </pic:pic>
+              </a:graphicData>
+            </a:graphic>
+          </wp:inline>
+        </w:drawing>
+      </w:r>
+    </w:p>
+    <w:p>
+      <w:r>
+        <w:lastRenderedPageBreak/>
+        <w:t>Q9) Write an SQL query to list all books sorted by category (ascending) and price (descending).</w:t>
+      </w:r>
+    </w:p>
+    <w:p>
+      <w:r>
+        <w:drawing>
+          <wp:inline distT="0" distB="0" distL="0" distR="0" wp14:anchorId="577DB6D9" wp14:editId="615E0C17">
+            <wp:extent cx="5731510" cy="1955409"/>
+            <wp:effectExtent l="0" t="0" r="2540" b="6985"/>
+            <wp:docPr id="9" name="Picture 9"/>
+            <wp:cNvGraphicFramePr>
+              <a:graphicFrameLocks xmlns:a="http://schemas.openxmlformats.org/drawingml/2006/main" noChangeAspect="1"/>
+            </wp:cNvGraphicFramePr>
+            <a:graphic xmlns:a="http://schemas.openxmlformats.org/drawingml/2006/main">
+              <a:graphicData uri="http://schemas.openxmlformats.org/drawingml/2006/picture">
+                <pic:pic xmlns:pic="http://schemas.openxmlformats.org/drawingml/2006/picture">
+                  <pic:nvPicPr>
+                    <pic:cNvPr id="1" name=""/>
+                    <pic:cNvPicPr/>
+                  </pic:nvPicPr>
+                  <pic:blipFill>
+                    <a:blip r:embed="rId12"/>
+                    <a:stretch>
+                      <a:fillRect/>
+                    </a:stretch>
+                  </pic:blipFill>
+                  <pic:spPr>
+                    <a:xfrm>
+                      <a:off x="0" y="0"/>
+                      <a:ext cx="5739155" cy="1958017"/>
+                    </a:xfrm>
+                    <a:prstGeom prst="rect">
+                      <a:avLst/>
+                    </a:prstGeom>
+                  </pic:spPr>
+                </pic:pic>
+              </a:graphicData>
+            </a:graphic>
+          </wp:inline>
+        </w:drawing>
+      </w:r>
+    </w:p>
+    <w:p>
+      <w:r>
+        <w:t>Q10) Write an SQL query to list all books whose name contains the word 'SQL'.</w:t>
+      </w:r>
+    </w:p>
+    <w:p>
+      <w:r>
+        <w:drawing>
+          <wp:inline distT="0" distB="0" distL="0" distR="0" wp14:anchorId="0F8BD14E" wp14:editId="78697621">
+            <wp:extent cx="5731510" cy="1596390"/>
+            <wp:effectExtent l="0" t="0" r="2540" b="3810"/>
+            <wp:docPr id="10" name="Picture 10"/>
+            <wp:cNvGraphicFramePr>
+              <a:graphicFrameLocks xmlns:a="http://schemas.openxmlformats.org/drawingml/2006/main" noChangeAspect="1"/>
+            </wp:cNvGraphicFramePr>
+            <a:graphic xmlns:a="http://schemas.openxmlformats.org/drawingml/2006/main">
+              <a:graphicData uri="http://schemas.openxmlformats.org/drawingml/2006/picture">
+                <pic:pic xmlns:pic="http://schemas.openxmlformats.org/drawingml/2006/picture">
+                  <pic:nvPicPr>
+                    <pic:cNvPr id="1" name=""/>
+                    <pic:cNvPicPr/>
+                  </pic:nvPicPr>
+                  <pic:blipFill>
+                    <a:blip r:embed="rId13"/>
+                    <a:stretch>
+                      <a:fillRect/>
+                    </a:stretch>
+                  </pic:blipFill>
+                  <pic:spPr>
+                    <a:xfrm>
+                      <a:off x="0" y="0"/>
+                      <a:ext cx="5731510" cy="1596390"/>
+                    </a:xfrm>
+                    <a:prstGeom prst="rect">
+                      <a:avLst/>
+                    </a:prstGeom>
+                  </pic:spPr>
+                </pic:pic>
+              </a:graphicData>
+            </a:graphic>
+          </wp:inline>
+        </w:drawing>
+      </w:r>
+    </w:p>
+    <w:p>
+      <w:r>
+        <w:t xml:space="preserve">Q11) Write an SQL query to display </w:t>
+      </w:r>
+      <w:proofErr w:type="spellStart"/>
+      <w:r>
+        <w:t>Lib_Issue_Id</w:t>
+      </w:r>
+      <w:proofErr w:type="spellEnd"/>
+      <w:r>
+        <w:t xml:space="preserve">, </w:t>
+      </w:r>
+      <w:proofErr w:type="spellStart"/>
+      <w:r>
+        <w:t>Issue_Date</w:t>
+      </w:r>
+      <w:proofErr w:type="spellEnd"/>
+      <w:r>
+        <w:t xml:space="preserve">, </w:t>
+      </w:r>
+      <w:proofErr w:type="spellStart"/>
+      <w:r>
+        <w:t>Return_Date</w:t>
+      </w:r>
+      <w:proofErr w:type="spellEnd"/>
+      <w:r>
+        <w:t xml:space="preserve"> and number of days</w:t>
+      </w:r>
+    </w:p>
+    <w:p>
+      <w:r>
+        <w:t>the book was issued.</w:t>
+      </w:r>
+    </w:p>
+    <w:p>
+      <w:r>
+        <w:drawing>
+          <wp:inline distT="0" distB="0" distL="0" distR="0" wp14:anchorId="77A4DD88" wp14:editId="44805DFB">
+            <wp:extent cx="5731055" cy="1885071"/>
+            <wp:effectExtent l="0" t="0" r="3175" b="1270"/>
+            <wp:docPr id="11" name="Picture 11"/>
+            <wp:cNvGraphicFramePr>
+              <a:graphicFrameLocks xmlns:a="http://schemas.openxmlformats.org/drawingml/2006/main" noChangeAspect="1"/>
+            </wp:cNvGraphicFramePr>
+            <a:graphic xmlns:a="http://schemas.openxmlformats.org/drawingml/2006/main">
+              <a:graphicData uri="http://schemas.openxmlformats.org/drawingml/2006/picture">
+                <pic:pic xmlns:pic="http://schemas.openxmlformats.org/drawingml/2006/picture">
+                  <pic:nvPicPr>
+                    <pic:cNvPr id="1" name=""/>
+                    <pic:cNvPicPr/>
+                  </pic:nvPicPr>
+                  <pic:blipFill>
+                    <a:blip r:embed="rId14"/>
+                    <a:stretch>
+                      <a:fillRect/>
+                    </a:stretch>
+                  </pic:blipFill>
+                  <pic:spPr>
+                    <a:xfrm>
+                      <a:off x="0" y="0"/>
+                      <a:ext cx="5736945" cy="1887008"/>
+                    </a:xfrm>
+                    <a:prstGeom prst="rect">
+                      <a:avLst/>
+                    </a:prstGeom>
+                  </pic:spPr>
+                </pic:pic>
+              </a:graphicData>
+            </a:graphic>
+          </wp:inline>
+        </w:drawing>
+      </w:r>
+    </w:p>
+    <w:p>
+      <w:r>
+        <w:t>Q12) Write an SQL query to list member details ordered by their joining date.</w:t>
+      </w:r>
+    </w:p>
+    <w:p>
+      <w:r>
+        <w:drawing>
+          <wp:inline distT="0" distB="0" distL="0" distR="0" wp14:anchorId="41BC27BE" wp14:editId="0F6CA07E">
+            <wp:extent cx="5731510" cy="1498209"/>
+            <wp:effectExtent l="0" t="0" r="2540" b="6985"/>
+            <wp:docPr id="12" name="Picture 12"/>
+            <wp:cNvGraphicFramePr>
+              <a:graphicFrameLocks xmlns:a="http://schemas.openxmlformats.org/drawingml/2006/main" noChangeAspect="1"/>
+            </wp:cNvGraphicFramePr>
+            <a:graphic xmlns:a="http://schemas.openxmlformats.org/drawingml/2006/main">
+              <a:graphicData uri="http://schemas.openxmlformats.org/drawingml/2006/picture">
+                <pic:pic xmlns:pic="http://schemas.openxmlformats.org/drawingml/2006/picture">
+                  <pic:nvPicPr>
+                    <pic:cNvPr id="1" name=""/>
+                    <pic:cNvPicPr/>
+                  </pic:nvPicPr>
+                  <pic:blipFill>
+                    <a:blip r:embed="rId15"/>
+                    <a:stretch>
+                      <a:fillRect/>
+                    </a:stretch>
+                  </pic:blipFill>
+                  <pic:spPr>
+                    <a:xfrm>
+                      <a:off x="0" y="0"/>
+                      <a:ext cx="5742181" cy="1500998"/>
+                    </a:xfrm>
+                    <a:prstGeom prst="rect">
+                      <a:avLst/>
+                    </a:prstGeom>
+                  </pic:spPr>
+                </pic:pic>
+              </a:graphicData>
+            </a:graphic>
+          </wp:inline>
+        </w:drawing>
+      </w:r>
+    </w:p>
+    <w:p>
+      <w:r>
+        <w:lastRenderedPageBreak/>
+        <w:t>Q13) Write an SQL query to count total books issued to member ID 1.</w:t>
+      </w:r>
+    </w:p>
+    <w:p>
+      <w:r>
+        <w:drawing>
+          <wp:inline distT="0" distB="0" distL="0" distR="0" wp14:anchorId="659DB06F" wp14:editId="312DE8C1">
+            <wp:extent cx="5731510" cy="1532255"/>
+            <wp:effectExtent l="0" t="0" r="2540" b="0"/>
+            <wp:docPr id="13" name="Picture 13"/>
+            <wp:cNvGraphicFramePr>
+              <a:graphicFrameLocks xmlns:a="http://schemas.openxmlformats.org/drawingml/2006/main" noChangeAspect="1"/>
+            </wp:cNvGraphicFramePr>
+            <a:graphic xmlns:a="http://schemas.openxmlformats.org/drawingml/2006/main">
+              <a:graphicData uri="http://schemas.openxmlformats.org/drawingml/2006/picture">
+                <pic:pic xmlns:pic="http://schemas.openxmlformats.org/drawingml/2006/picture">
+                  <pic:nvPicPr>
+                    <pic:cNvPr id="1" name=""/>
+                    <pic:cNvPicPr/>
+                  </pic:nvPicPr>
+                  <pic:blipFill>
+                    <a:blip r:embed="rId16"/>
+                    <a:stretch>
+                      <a:fillRect/>
+                    </a:stretch>
+                  </pic:blipFill>
+                  <pic:spPr>
+                    <a:xfrm>
+                      <a:off x="0" y="0"/>
+                      <a:ext cx="5731510" cy="1532255"/>
+                    </a:xfrm>
+                    <a:prstGeom prst="rect">
+                      <a:avLst/>
+                    </a:prstGeom>
+                  </pic:spPr>
+                </pic:pic>
+              </a:graphicData>
+            </a:graphic>
+          </wp:inline>
+        </w:drawing>
+      </w:r>
+    </w:p>
+    <w:p>
+      <w:r>
+        <w:t>Q14) Write an SQL query to display total penalty due for all members.</w:t>
+      </w:r>
+    </w:p>
+    <w:p>
+      <w:r>
+        <w:drawing>
+          <wp:inline distT="0" distB="0" distL="0" distR="0" wp14:anchorId="6A7F41F0" wp14:editId="5FC750DF">
+            <wp:extent cx="5731510" cy="1258570"/>
+            <wp:effectExtent l="0" t="0" r="2540" b="0"/>
+            <wp:docPr id="14" name="Picture 14"/>
+            <wp:cNvGraphicFramePr>
+              <a:graphicFrameLocks xmlns:a="http://schemas.openxmlformats.org/drawingml/2006/main" noChangeAspect="1"/>
+            </wp:cNvGraphicFramePr>
+            <a:graphic xmlns:a="http://schemas.openxmlformats.org/drawingml/2006/main">
+              <a:graphicData uri="http://schemas.openxmlformats.org/drawingml/2006/picture">
+                <pic:pic xmlns:pic="http://schemas.openxmlformats.org/drawingml/2006/picture">
+                  <pic:nvPicPr>
+                    <pic:cNvPr id="1" name=""/>
+                    <pic:cNvPicPr/>
+                  </pic:nvPicPr>
+                  <pic:blipFill>
+                    <a:blip r:embed="rId17"/>
+                    <a:stretch>
+                      <a:fillRect/>
+                    </a:stretch>
+                  </pic:blipFill>
+                  <pic:spPr>
+                    <a:xfrm>
+                      <a:off x="0" y="0"/>
+                      <a:ext cx="5731510" cy="1258570"/>
+                    </a:xfrm>
+                    <a:prstGeom prst="rect">
+                      <a:avLst/>
+                    </a:prstGeom>
+                  </pic:spPr>
+                </pic:pic>
+              </a:graphicData>
+            </a:graphic>
+          </wp:inline>
+        </w:drawing>
+      </w:r>
+    </w:p>
+    <w:p>
+      <w:r>
+        <w:t>Q15) Write an SQL query to display total number of members.</w:t>
+      </w:r>
+    </w:p>
+    <w:p>
+      <w:r>
+        <w:drawing>
+          <wp:inline distT="0" distB="0" distL="0" distR="0" wp14:anchorId="5F160D6A" wp14:editId="7F60B879">
+            <wp:extent cx="5731510" cy="1294130"/>
+            <wp:effectExtent l="0" t="0" r="2540" b="1270"/>
+            <wp:docPr id="15" name="Picture 15"/>
+            <wp:cNvGraphicFramePr>
+              <a:graphicFrameLocks xmlns:a="http://schemas.openxmlformats.org/drawingml/2006/main" noChangeAspect="1"/>
+            </wp:cNvGraphicFramePr>
+            <a:graphic xmlns:a="http://schemas.openxmlformats.org/drawingml/2006/main">
+              <a:graphicData uri="http://schemas.openxmlformats.org/drawingml/2006/picture">
+                <pic:pic xmlns:pic="http://schemas.openxmlformats.org/drawingml/2006/picture">
+                  <pic:nvPicPr>
+                    <pic:cNvPr id="1" name=""/>
+                    <pic:cNvPicPr/>
+                  </pic:nvPicPr>
+                  <pic:blipFill>
+                    <a:blip r:embed="rId18"/>
+                    <a:stretch>
+                      <a:fillRect/>
+                    </a:stretch>
+                  </pic:blipFill>
+                  <pic:spPr>
+                    <a:xfrm>
+                      <a:off x="0" y="0"/>
+                      <a:ext cx="5731510" cy="1294130"/>
+                    </a:xfrm>
+                    <a:prstGeom prst="rect">
+                      <a:avLst/>
+                    </a:prstGeom>
+                  </pic:spPr>
+                </pic:pic>
+              </a:graphicData>
+            </a:graphic>
+          </wp:inline>
+        </w:drawing>
+      </w:r>
+    </w:p>
+    <w:p>
+      <w:r>
+        <w:t>Q16) Write an SQL query to display total number of books issued.</w:t>
+      </w:r>
+    </w:p>
+    <w:p>
+      <w:r>
+        <w:drawing>
+          <wp:inline distT="0" distB="0" distL="0" distR="0" wp14:anchorId="6E518381" wp14:editId="6CD68681">
+            <wp:extent cx="5731510" cy="1329690"/>
+            <wp:effectExtent l="0" t="0" r="2540" b="3810"/>
+            <wp:docPr id="16" name="Picture 16"/>
+            <wp:cNvGraphicFramePr>
+              <a:graphicFrameLocks xmlns:a="http://schemas.openxmlformats.org/drawingml/2006/main" noChangeAspect="1"/>
+            </wp:cNvGraphicFramePr>
+            <a:graphic xmlns:a="http://schemas.openxmlformats.org/drawingml/2006/main">
+              <a:graphicData uri="http://schemas.openxmlformats.org/drawingml/2006/picture">
+                <pic:pic xmlns:pic="http://schemas.openxmlformats.org/drawingml/2006/picture">
+                  <pic:nvPicPr>
+                    <pic:cNvPr id="1" name=""/>
+                    <pic:cNvPicPr/>
+                  </pic:nvPicPr>
+                  <pic:blipFill>
+                    <a:blip r:embed="rId19"/>
+                    <a:stretch>
+                      <a:fillRect/>
+                    </a:stretch>
+                  </pic:blipFill>
+                  <pic:spPr>
+                    <a:xfrm>
+                      <a:off x="0" y="0"/>
+                      <a:ext cx="5731510" cy="1329690"/>
+                    </a:xfrm>
+                    <a:prstGeom prst="rect">
+                      <a:avLst/>
+                    </a:prstGeom>
+                  </pic:spPr>
+                </pic:pic>
+              </a:graphicData>
+            </a:graphic>
+          </wp:inline>
+        </w:drawing>
+      </w:r>
+    </w:p>
+    <w:p>
+      <w:r>
+        <w:t>Q17) Write an SQL query to display average membership fees paid by all members.</w:t>
+      </w:r>
+    </w:p>
+    <w:p>
+      <w:r>
+        <w:drawing>
+          <wp:inline distT="0" distB="0" distL="0" distR="0" wp14:anchorId="50EA5E7D" wp14:editId="536285EA">
+            <wp:extent cx="5731510" cy="1453515"/>
+            <wp:effectExtent l="0" t="0" r="2540" b="0"/>
+            <wp:docPr id="17" name="Picture 17"/>
+            <wp:cNvGraphicFramePr>
+              <a:graphicFrameLocks xmlns:a="http://schemas.openxmlformats.org/drawingml/2006/main" noChangeAspect="1"/>
+            </wp:cNvGraphicFramePr>
+            <a:graphic xmlns:a="http://schemas.openxmlformats.org/drawingml/2006/main">
+              <a:graphicData uri="http://schemas.openxmlformats.org/drawingml/2006/picture">
+                <pic:pic xmlns:pic="http://schemas.openxmlformats.org/drawingml/2006/picture">
+                  <pic:nvPicPr>
+                    <pic:cNvPr id="1" name=""/>
+                    <pic:cNvPicPr/>
+                  </pic:nvPicPr>
+                  <pic:blipFill>
+                    <a:blip r:embed="rId20"/>
+                    <a:stretch>
+                      <a:fillRect/>
+                    </a:stretch>
+                  </pic:blipFill>
+                  <pic:spPr>
+                    <a:xfrm>
+                      <a:off x="0" y="0"/>
+                      <a:ext cx="5731510" cy="1453515"/>
+                    </a:xfrm>
+                    <a:prstGeom prst="rect">
+                      <a:avLst/>
+                    </a:prstGeom>
+                  </pic:spPr>
+                </pic:pic>
+              </a:graphicData>
+            </a:graphic>
+          </wp:inline>
+        </w:drawing>
+      </w:r>
+    </w:p>
+    <w:p>
+      <w:r>
+        <w:lastRenderedPageBreak/>
+        <w:t>Q18) Write an SQL query to display each category and number of books in that category.</w:t>
+      </w:r>
+    </w:p>
+    <w:p>
+      <w:r>
+        <w:drawing>
+          <wp:inline distT="0" distB="0" distL="0" distR="0" wp14:anchorId="0876EA17" wp14:editId="6839E0A0">
+            <wp:extent cx="5731510" cy="1652954"/>
+            <wp:effectExtent l="0" t="0" r="2540" b="4445"/>
+            <wp:docPr id="18" name="Picture 18"/>
+            <wp:cNvGraphicFramePr>
+              <a:graphicFrameLocks xmlns:a="http://schemas.openxmlformats.org/drawingml/2006/main" noChangeAspect="1"/>
+            </wp:cNvGraphicFramePr>
+            <a:graphic xmlns:a="http://schemas.openxmlformats.org/drawingml/2006/main">
+              <a:graphicData uri="http://schemas.openxmlformats.org/drawingml/2006/picture">
+                <pic:pic xmlns:pic="http://schemas.openxmlformats.org/drawingml/2006/picture">
+                  <pic:nvPicPr>
+                    <pic:cNvPr id="1" name=""/>
+                    <pic:cNvPicPr/>
+                  </pic:nvPicPr>
+                  <pic:blipFill>
+                    <a:blip r:embed="rId21"/>
+                    <a:stretch>
+                      <a:fillRect/>
+                    </a:stretch>
+                  </pic:blipFill>
+                  <pic:spPr>
+                    <a:xfrm>
+                      <a:off x="0" y="0"/>
+                      <a:ext cx="5737419" cy="1654658"/>
+                    </a:xfrm>
+                    <a:prstGeom prst="rect">
+                      <a:avLst/>
+                    </a:prstGeom>
+                  </pic:spPr>
+                </pic:pic>
+              </a:graphicData>
+            </a:graphic>
+          </wp:inline>
+        </w:drawing>
+      </w:r>
+    </w:p>
+    <w:p>
+      <w:r>
+        <w:t xml:space="preserve">Q19) Write an SQL query to display </w:t>
+      </w:r>
+      <w:proofErr w:type="spellStart"/>
+      <w:r>
+        <w:t>book_no</w:t>
+      </w:r>
+      <w:proofErr w:type="spellEnd"/>
+      <w:r>
+        <w:t xml:space="preserve"> and number of times each book is issued, sorted</w:t>
+      </w:r>
+    </w:p>
+    <w:p>
+      <w:r>
+        <w:t>by count descending.</w:t>
+      </w:r>
+    </w:p>
+    <w:p>
+      <w:r>
+        <w:drawing>
+          <wp:inline distT="0" distB="0" distL="0" distR="0" wp14:anchorId="0E2368F7" wp14:editId="5A7C695F">
+            <wp:extent cx="5731174" cy="2229730"/>
+            <wp:effectExtent l="0" t="0" r="3175" b="0"/>
+            <wp:docPr id="19" name="Picture 19"/>
+            <wp:cNvGraphicFramePr>
+              <a:graphicFrameLocks xmlns:a="http://schemas.openxmlformats.org/drawingml/2006/main" noChangeAspect="1"/>
+            </wp:cNvGraphicFramePr>
+            <a:graphic xmlns:a="http://schemas.openxmlformats.org/drawingml/2006/main">
+              <a:graphicData uri="http://schemas.openxmlformats.org/drawingml/2006/picture">
+                <pic:pic xmlns:pic="http://schemas.openxmlformats.org/drawingml/2006/picture">
+                  <pic:nvPicPr>
+                    <pic:cNvPr id="1" name=""/>
+                    <pic:cNvPicPr/>
+                  </pic:nvPicPr>
+                  <pic:blipFill>
+                    <a:blip r:embed="rId22"/>
+                    <a:stretch>
+                      <a:fillRect/>
+                    </a:stretch>
+                  </pic:blipFill>
+                  <pic:spPr>
+                    <a:xfrm>
+                      <a:off x="0" y="0"/>
+                      <a:ext cx="5739289" cy="2232887"/>
+                    </a:xfrm>
+                    <a:prstGeom prst="rect">
+                      <a:avLst/>
+                    </a:prstGeom>
+                  </pic:spPr>
+                </pic:pic>
+              </a:graphicData>
+            </a:graphic>
+          </wp:inline>
+        </w:drawing>
+      </w:r>
+    </w:p>
+    <w:p>
+      <w:r>
+        <w:t>Q20) Write an SQL query to display maximum, minimum, total and average penalty amount</w:t>
+      </w:r>
+    </w:p>
+    <w:p>
+      <w:r>
+        <w:t>from Member table.</w:t>
+      </w:r>
+    </w:p>
+    <w:p>
+      <w:r>
+        <w:drawing>
+          <wp:inline distT="0" distB="0" distL="0" distR="0" wp14:anchorId="27F7A143" wp14:editId="5AA463D2">
+            <wp:extent cx="5729339" cy="1603717"/>
+            <wp:effectExtent l="0" t="0" r="5080" b="0"/>
+            <wp:docPr id="20" name="Picture 20"/>
+            <wp:cNvGraphicFramePr>
+              <a:graphicFrameLocks xmlns:a="http://schemas.openxmlformats.org/drawingml/2006/main" noChangeAspect="1"/>
+            </wp:cNvGraphicFramePr>
+            <a:graphic xmlns:a="http://schemas.openxmlformats.org/drawingml/2006/main">
+              <a:graphicData uri="http://schemas.openxmlformats.org/drawingml/2006/picture">
+                <pic:pic xmlns:pic="http://schemas.openxmlformats.org/drawingml/2006/picture">
+                  <pic:nvPicPr>
+                    <pic:cNvPr id="1" name=""/>
+                    <pic:cNvPicPr/>
+                  </pic:nvPicPr>
+                  <pic:blipFill>
+                    <a:blip r:embed="rId23"/>
+                    <a:stretch>
+                      <a:fillRect/>
+                    </a:stretch>
+                  </pic:blipFill>
+                  <pic:spPr>
+                    <a:xfrm>
+                      <a:off x="0" y="0"/>
+                      <a:ext cx="5762596" cy="1613026"/>
+                    </a:xfrm>
+                    <a:prstGeom prst="rect">
+                      <a:avLst/>
+                    </a:prstGeom>
+                  </pic:spPr>
+                </pic:pic>
+              </a:graphicData>
+            </a:graphic>
+          </wp:inline>
+        </w:drawing>
+      </w:r>
+    </w:p>
+    <w:p>
+      <w:r>
+        <w:t>Q21) Write an SQL query to display member IDs who have issued more than 2 books.</w:t>
+      </w:r>
+    </w:p>
+    <w:p>
+      <w:r>
+        <w:drawing>
+          <wp:inline distT="0" distB="0" distL="0" distR="0" wp14:anchorId="6C78737D" wp14:editId="7B8A465D">
+            <wp:extent cx="5729753" cy="1280160"/>
+            <wp:effectExtent l="0" t="0" r="4445" b="0"/>
+            <wp:docPr id="21" name="Picture 21"/>
+            <wp:cNvGraphicFramePr>
+              <a:graphicFrameLocks xmlns:a="http://schemas.openxmlformats.org/drawingml/2006/main" noChangeAspect="1"/>
+            </wp:cNvGraphicFramePr>
+            <a:graphic xmlns:a="http://schemas.openxmlformats.org/drawingml/2006/main">
+              <a:graphicData uri="http://schemas.openxmlformats.org/drawingml/2006/picture">
+                <pic:pic xmlns:pic="http://schemas.openxmlformats.org/drawingml/2006/picture">
+                  <pic:nvPicPr>
+                    <pic:cNvPr id="1" name=""/>
+                    <pic:cNvPicPr/>
+                  </pic:nvPicPr>
+                  <pic:blipFill>
+                    <a:blip r:embed="rId24"/>
+                    <a:stretch>
+                      <a:fillRect/>
+                    </a:stretch>
+                  </pic:blipFill>
+                  <pic:spPr>
+                    <a:xfrm>
+                      <a:off x="0" y="0"/>
+                      <a:ext cx="5759233" cy="1286746"/>
+                    </a:xfrm>
+                    <a:prstGeom prst="rect">
+                      <a:avLst/>
+                    </a:prstGeom>
+                  </pic:spPr>
+                </pic:pic>
+              </a:graphicData>
+            </a:graphic>
+          </wp:inline>
+        </w:drawing>
+      </w:r>
+    </w:p>
+    <w:p>
+      <w:r>
+        <w:lastRenderedPageBreak/>
+        <w:t xml:space="preserve">Q22) Write an SQL query to display </w:t>
+      </w:r>
+      <w:proofErr w:type="spellStart"/>
+      <w:r>
+        <w:t>member_id</w:t>
+      </w:r>
+      <w:proofErr w:type="spellEnd"/>
+      <w:r>
+        <w:t xml:space="preserve">, </w:t>
+      </w:r>
+      <w:proofErr w:type="spellStart"/>
+      <w:r>
+        <w:t>book_no</w:t>
+      </w:r>
+      <w:proofErr w:type="spellEnd"/>
+      <w:r>
+        <w:t xml:space="preserve"> and number of times the same book</w:t>
+      </w:r>
+    </w:p>
+    <w:p>
+      <w:r>
+        <w:t>was issued by that member.</w:t>
+      </w:r>
+    </w:p>
+    <w:p>
+      <w:r>
+        <w:drawing>
+          <wp:inline distT="0" distB="0" distL="0" distR="0" wp14:anchorId="3CA83471" wp14:editId="51BB8025">
+            <wp:extent cx="5731510" cy="2089150"/>
+            <wp:effectExtent l="0" t="0" r="2540" b="6350"/>
+            <wp:docPr id="22" name="Picture 22"/>
+            <wp:cNvGraphicFramePr>
+              <a:graphicFrameLocks xmlns:a="http://schemas.openxmlformats.org/drawingml/2006/main" noChangeAspect="1"/>
+            </wp:cNvGraphicFramePr>
+            <a:graphic xmlns:a="http://schemas.openxmlformats.org/drawingml/2006/main">
+              <a:graphicData uri="http://schemas.openxmlformats.org/drawingml/2006/picture">
+                <pic:pic xmlns:pic="http://schemas.openxmlformats.org/drawingml/2006/picture">
+                  <pic:nvPicPr>
+                    <pic:cNvPr id="1" name=""/>
+                    <pic:cNvPicPr/>
+                  </pic:nvPicPr>
+                  <pic:blipFill>
+                    <a:blip r:embed="rId25"/>
+                    <a:stretch>
+                      <a:fillRect/>
+                    </a:stretch>
+                  </pic:blipFill>
+                  <pic:spPr>
+                    <a:xfrm>
+                      <a:off x="0" y="0"/>
+                      <a:ext cx="5731510" cy="2089150"/>
+                    </a:xfrm>
+                    <a:prstGeom prst="rect">
+                      <a:avLst/>
+                    </a:prstGeom>
+                  </pic:spPr>
+                </pic:pic>
+              </a:graphicData>
+            </a:graphic>
+          </wp:inline>
+        </w:drawing>
+      </w:r>
+    </w:p>
+    <w:p>
+      <w:r>
+        <w:t>Q23) Write an SQL query to display month-wise count of books issued, sorted by count</w:t>
+      </w:r>
+    </w:p>
+    <w:p>
+      <w:r>
+        <w:t>descending.</w:t>
+      </w:r>
+    </w:p>
+    <w:p>
       <w:bookmarkStart w:id="0" w:name="_GoBack"/>
+      <w:r>
+        <w:drawing>
+          <wp:inline distT="0" distB="0" distL="0" distR="0" wp14:anchorId="255BD6AE" wp14:editId="001C3C68">
+            <wp:extent cx="5731510" cy="2206625"/>
+            <wp:effectExtent l="0" t="0" r="2540" b="3175"/>
+            <wp:docPr id="23" name="Picture 23"/>
+            <wp:cNvGraphicFramePr>
+              <a:graphicFrameLocks xmlns:a="http://schemas.openxmlformats.org/drawingml/2006/main" noChangeAspect="1"/>
+            </wp:cNvGraphicFramePr>
+            <a:graphic xmlns:a="http://schemas.openxmlformats.org/drawingml/2006/main">
+              <a:graphicData uri="http://schemas.openxmlformats.org/drawingml/2006/picture">
+                <pic:pic xmlns:pic="http://schemas.openxmlformats.org/drawingml/2006/picture">
+                  <pic:nvPicPr>
+                    <pic:cNvPr id="1" name=""/>
+                    <pic:cNvPicPr/>
+                  </pic:nvPicPr>
+                  <pic:blipFill>
+                    <a:blip r:embed="rId26"/>
+                    <a:stretch>
+                      <a:fillRect/>
+                    </a:stretch>
+                  </pic:blipFill>
+                  <pic:spPr>
+                    <a:xfrm>
+                      <a:off x="0" y="0"/>
+                      <a:ext cx="5731510" cy="2206625"/>
+                    </a:xfrm>
+                    <a:prstGeom prst="rect">
+                      <a:avLst/>
+                    </a:prstGeom>
+                  </pic:spPr>
+                </pic:pic>
+              </a:graphicData>
+            </a:graphic>
+          </wp:inline>
+        </w:drawing>
+      </w:r>
       <w:bookmarkEnd w:id="0"/>
     </w:p>
     <w:p>
       <w:r>
-        <w:t>Q4) Write an SQL query to display issue details of books issued for more than 30 days.</w:t>
+        <w:t>Q24) Write an SQL query to list book numbers of books that have never been issued.</w:t>
       </w:r>
     </w:p>
     <w:p/>
     <w:p>
       <w:r>
-        <w:t>Q5) Write an SQL query to list all books priced between 500 and 750 and belonging to category</w:t>
-      </w:r>
-    </w:p>
-    <w:p>
-      <w:r>
-        <w:t>'Database'.</w:t>
+        <w:t>Q25) Write an SQL query to list member IDs who exist in Member table and have issued at least</w:t>
+      </w:r>
+    </w:p>
+    <w:p>
+      <w:r>
+        <w:t>one book.</w:t>
       </w:r>
     </w:p>
     <w:p/>
     <w:p>
       <w:r>
-        <w:t>Q6) Write an SQL query to list all books belonging to categories Science, Database, Fiction, or</w:t>
-      </w:r>
-    </w:p>
-    <w:p>
-      <w:r>
-        <w:t>Management.</w:t>
+        <w:t>Q26) Write an SQL query to display member ID with highest and lowest number of books</w:t>
+      </w:r>
+    </w:p>
+    <w:p>
+      <w:r>
+        <w:t>issued.</w:t>
       </w:r>
     </w:p>
     <w:p/>
     <w:p>
       <w:r>
-        <w:t>Q7) Write an SQL query to list all members in descending order of penalty amount.</w:t>
+        <w:t>Q27) Write an SQL query to list issue details for books issued in December or July.</w:t>
+      </w:r>
+    </w:p>
+    <w:p>
+      <w:r>
+        <w:t xml:space="preserve">Q28) Write an SQL query to display </w:t>
+      </w:r>
+      <w:proofErr w:type="spellStart"/>
+      <w:r>
+        <w:t>Book_No</w:t>
+      </w:r>
+      <w:proofErr w:type="spellEnd"/>
+      <w:r>
+        <w:t xml:space="preserve">, </w:t>
+      </w:r>
+      <w:proofErr w:type="spellStart"/>
+      <w:r>
+        <w:t>Book_Name</w:t>
+      </w:r>
+      <w:proofErr w:type="spellEnd"/>
+      <w:r>
+        <w:t xml:space="preserve"> and </w:t>
+      </w:r>
+      <w:proofErr w:type="spellStart"/>
+      <w:r>
+        <w:t>Issue_Date</w:t>
+      </w:r>
+      <w:proofErr w:type="spellEnd"/>
+      <w:r>
+        <w:t xml:space="preserve"> for books issued in</w:t>
+      </w:r>
+    </w:p>
+    <w:p>
+      <w:r>
+        <w:t>December and belonging to category Database.</w:t>
+      </w:r>
+    </w:p>
+    <w:p>
+      <w:r>
+        <w:lastRenderedPageBreak/>
+        <w:t xml:space="preserve">Q29) Write an SQL query to display </w:t>
+      </w:r>
+      <w:proofErr w:type="spellStart"/>
+      <w:r>
+        <w:t>Member_Id</w:t>
+      </w:r>
+      <w:proofErr w:type="spellEnd"/>
+      <w:r>
+        <w:t xml:space="preserve">, </w:t>
+      </w:r>
+      <w:proofErr w:type="spellStart"/>
+      <w:r>
+        <w:t>Member_Name</w:t>
+      </w:r>
+      <w:proofErr w:type="spellEnd"/>
+      <w:r>
+        <w:t xml:space="preserve"> and </w:t>
+      </w:r>
+      <w:proofErr w:type="spellStart"/>
+      <w:r>
+        <w:t>Max_Books_Allowed</w:t>
+      </w:r>
+      <w:proofErr w:type="spellEnd"/>
+    </w:p>
+    <w:p>
+      <w:r>
+        <w:t xml:space="preserve">sorted by </w:t>
+      </w:r>
+      <w:proofErr w:type="spellStart"/>
+      <w:r>
+        <w:t>Max_Books_Allowed</w:t>
+      </w:r>
+      <w:proofErr w:type="spellEnd"/>
+      <w:r>
+        <w:t xml:space="preserve"> descending.</w:t>
+      </w:r>
+    </w:p>
+    <w:p>
+      <w:r>
+        <w:t xml:space="preserve">Q30) Write an SQL query to list </w:t>
+      </w:r>
+      <w:proofErr w:type="spellStart"/>
+      <w:r>
+        <w:t>Book_No</w:t>
+      </w:r>
+      <w:proofErr w:type="spellEnd"/>
+      <w:r>
+        <w:t xml:space="preserve">, </w:t>
+      </w:r>
+      <w:proofErr w:type="spellStart"/>
+      <w:r>
+        <w:t>Book_Name</w:t>
+      </w:r>
+      <w:proofErr w:type="spellEnd"/>
+      <w:r>
+        <w:t xml:space="preserve">, </w:t>
+      </w:r>
+      <w:proofErr w:type="spellStart"/>
+      <w:r>
+        <w:t>Issue_Date</w:t>
+      </w:r>
+      <w:proofErr w:type="spellEnd"/>
+      <w:r>
+        <w:t xml:space="preserve"> and </w:t>
+      </w:r>
+      <w:proofErr w:type="spellStart"/>
+      <w:r>
+        <w:t>Return_Date</w:t>
+      </w:r>
+      <w:proofErr w:type="spellEnd"/>
+      <w:r>
+        <w:t xml:space="preserve"> for all</w:t>
+      </w:r>
+    </w:p>
+    <w:p>
+      <w:r>
+        <w:t>books issued by member 'Richa Sharma'.</w:t>
       </w:r>
     </w:p>
     <w:p/>
     <w:p>
       <w:r>
-        <w:t>Q8) Write an SQL query to update book number 103 with cost = 300 and category = 'RDBMS'.</w:t>
+        <w:t>Q31) Write an SQL query to list details of members who have issued books in Database</w:t>
+      </w:r>
+    </w:p>
+    <w:p>
+      <w:r>
+        <w:t>category.</w:t>
+      </w:r>
+    </w:p>
+    <w:p>
+      <w:r>
+        <w:t>Q32) Write an SQL query to list books having the highest price in each category.</w:t>
+      </w:r>
+    </w:p>
+    <w:p>
+      <w:r>
+        <w:t xml:space="preserve">Q33) Write an SQL query to list issue details where </w:t>
+      </w:r>
+      <w:proofErr w:type="spellStart"/>
+      <w:r>
+        <w:t>issue_date</w:t>
+      </w:r>
+      <w:proofErr w:type="spellEnd"/>
+      <w:r>
+        <w:t xml:space="preserve"> is outside the membership period</w:t>
+      </w:r>
+    </w:p>
+    <w:p>
+      <w:r>
+        <w:t>of that member.</w:t>
+      </w:r>
+    </w:p>
+    <w:p>
+      <w:r>
+        <w:t>Q34) Write an SQL query to list members who have not issued any book so far.</w:t>
+      </w:r>
+    </w:p>
+    <w:p>
+      <w:r>
+        <w:t>Q35) Write an SQL query to list members who have issued the same book as issued by 'Garima</w:t>
+      </w:r>
+    </w:p>
+    <w:p>
+      <w:r>
+        <w:t>Sen'.</w:t>
+      </w:r>
+    </w:p>
+    <w:p>
+      <w:r>
+        <w:t>Q36) Write an SQL query to list book name and price of books not returned for more than 30</w:t>
+      </w:r>
+    </w:p>
+    <w:p>
+      <w:r>
+        <w:t>days.</w:t>
+      </w:r>
+    </w:p>
+    <w:p>
+      <w:r>
+        <w:t>Q37) Write an SQL query to list authors who have written more than one book.</w:t>
+      </w:r>
+    </w:p>
+    <w:p>
+      <w:r>
+        <w:t>Q38) Write an SQL query to display member(s) who issued the maximum and minimum number</w:t>
+      </w:r>
+    </w:p>
+    <w:p>
+      <w:r>
+        <w:t>of books.</w:t>
+      </w:r>
+    </w:p>
+    <w:p>
+      <w:r>
+        <w:t>Q39) Write an SQL query to list details of top 3 highest priced books.</w:t>
+      </w:r>
+    </w:p>
+    <w:p>
+      <w:r>
+        <w:t>Q40) Write an SQL query to calculate total cost of books currently issued but not returned.</w:t>
+      </w:r>
+    </w:p>
+    <w:p>
+      <w:r>
+        <w:t>Q41) Write an SQL query to display the book issued maximum number of times.</w:t>
+      </w:r>
+    </w:p>
+    <w:p>
+      <w:r>
+        <w:t>Q42) Write an SQL query to count how many books are issued to Lifetime members.</w:t>
+      </w:r>
+    </w:p>
+    <w:p>
+      <w:r>
+        <w:t>Q43) Write an SQL query to display each membership type and number of members in that type.</w:t>
+      </w:r>
+    </w:p>
+    <w:p>
+      <w:r>
+        <w:t>Q44) Write an SQL query to list first 5 members who joined the library.</w:t>
+      </w:r>
+    </w:p>
+    <w:p>
+      <w:r>
+        <w:t>Q45) Write an SQL query to list members (with membership type) who issued books during</w:t>
+      </w:r>
+    </w:p>
+    <w:p>
+      <w:r>
+        <w:t>December month.</w:t>
+      </w:r>
+    </w:p>
+    <w:p>
+      <w:r>
+        <w:t>Q46) Write an SQL query to list members who have not returned books yet.</w:t>
       </w:r>
     </w:p>
     <w:p/>
     <w:p>
       <w:r>
-        <w:t>Q9) Write an SQL query to list all books sorted by category (ascending) and price (descending).</w:t>
-      </w:r>
-    </w:p>
-    <w:p/>
-    <w:p>
-      <w:r>
-        <w:t>Q10) Write an SQL query to list all books whose name contains the word 'SQL'.</w:t>
-      </w:r>
-    </w:p>
-    <w:p/>
-    <w:p>
-      <w:r>
-        <w:t xml:space="preserve">Q11) Write an SQL query to display </w:t>
+        <w:t>Q47) Write an SQL query to list members who joined on the same date as 'Garima Sen'.</w:t>
+      </w:r>
+    </w:p>
+    <w:p>
+      <w:r>
+        <w:t>Q48) Write an SQL query to list members who issued books written by author '</w:t>
       </w:r>
       <w:proofErr w:type="spellStart"/>
       <w:r>
-        <w:t>Lib_Issue_Id</w:t>
+        <w:t>Loni</w:t>
       </w:r>
       <w:proofErr w:type="spellEnd"/>
       <w:r>
-        <w:t xml:space="preserve">, </w:t>
-      </w:r>
-      <w:proofErr w:type="spellStart"/>
-      <w:r>
-        <w:t>Issue_Date</w:t>
-      </w:r>
-      <w:proofErr w:type="spellEnd"/>
-      <w:r>
-        <w:t xml:space="preserve">, </w:t>
-      </w:r>
-      <w:proofErr w:type="spellStart"/>
-      <w:r>
-        <w:t>Return_Date</w:t>
-      </w:r>
-      <w:proofErr w:type="spellEnd"/>
-      <w:r>
-        <w:t xml:space="preserve"> and number of days</w:t>
-      </w:r>
-    </w:p>
-    <w:p>
-      <w:r>
-        <w:t>the book was issued.</w:t>
-      </w:r>
-    </w:p>
-    <w:p/>
-    <w:p>
-      <w:r>
-        <w:t>Q12) Write an SQL query to list member details ordered by their joining date.</w:t>
-      </w:r>
-    </w:p>
-    <w:p/>
-    <w:p>
-      <w:r>
-        <w:t>Q13) Write an SQL query to count total books issued to member ID 1.</w:t>
-      </w:r>
-    </w:p>
-    <w:p/>
-    <w:p>
-      <w:r>
-        <w:t>Q14) Write an SQL query to display total penalty due for all members.</w:t>
-      </w:r>
-    </w:p>
-    <w:p>
-      <w:r>
-        <w:t>Q15) Write an SQL query to display total number of members.</w:t>
-      </w:r>
-    </w:p>
-    <w:p>
-      <w:r>
-        <w:t>Q16) Write an SQL query to display total number of books issued.</w:t>
-      </w:r>
-    </w:p>
-    <w:p/>
-    <w:p>
-      <w:r>
-        <w:t>Q17) Write an SQL query to display average membership fees paid by all members.</w:t>
-      </w:r>
-    </w:p>
-    <w:p>
-      <w:r>
-        <w:t>Q18) Write an SQL query to display each category and number of books in that category.</w:t>
-      </w:r>
-    </w:p>
-    <w:p>
-      <w:r>
-        <w:t xml:space="preserve">Q19) Write an SQL query to display </w:t>
-      </w:r>
-      <w:proofErr w:type="spellStart"/>
-      <w:r>
-        <w:t>book_no</w:t>
-      </w:r>
-      <w:proofErr w:type="spellEnd"/>
-      <w:r>
-        <w:t xml:space="preserve"> and number of times each book is issued, sorted</w:t>
-      </w:r>
-    </w:p>
-    <w:p>
-      <w:r>
-        <w:t>by count descending.</w:t>
-      </w:r>
-    </w:p>
-    <w:p>
-      <w:r>
-        <w:t>Q20) Write an SQL query to display maximum, minimum, total and average penalty amount</w:t>
-      </w:r>
-    </w:p>
-    <w:p>
-      <w:r>
-        <w:t>from Member table.</w:t>
-      </w:r>
-    </w:p>
-    <w:p>
-      <w:r>
-        <w:t>Q21) Write an SQL query to display member IDs who have issued more than 2 books.</w:t>
-      </w:r>
-    </w:p>
-    <w:p>
-      <w:r>
-        <w:t xml:space="preserve">Q22) Write an SQL query to display </w:t>
-      </w:r>
-      <w:proofErr w:type="spellStart"/>
-      <w:r>
-        <w:t>member_id</w:t>
-      </w:r>
-      <w:proofErr w:type="spellEnd"/>
-      <w:r>
-        <w:t xml:space="preserve">, </w:t>
-      </w:r>
-      <w:proofErr w:type="spellStart"/>
-      <w:r>
-        <w:t>book_no</w:t>
-      </w:r>
-      <w:proofErr w:type="spellEnd"/>
-      <w:r>
-        <w:t xml:space="preserve"> and number of times the same book</w:t>
-      </w:r>
-    </w:p>
-    <w:p>
-      <w:r>
-        <w:t>was issued by that member.</w:t>
-      </w:r>
-    </w:p>
-    <w:p>
-      <w:r>
-        <w:t>Q23) Write an SQL query to display month-wise count of books issued, sorted by count</w:t>
-      </w:r>
-    </w:p>
-    <w:p>
-      <w:r>
-        <w:t>descending.</w:t>
+        <w:t>' in</w:t>
+      </w:r>
+    </w:p>
+    <w:p>
+      <w:r>
+        <w:t>December.</w:t>
       </w:r>
     </w:p>
     <w:p>
       <w:r>
         <w:lastRenderedPageBreak/>
-        <w:t>Q24) Write an SQL query to list book numbers of books that have never been issued.</w:t>
-      </w:r>
-    </w:p>
-    <w:p>
-      <w:r>
-        <w:t>Q25) Write an SQL query to list member IDs who exist in Member table and have issued at least</w:t>
-      </w:r>
-    </w:p>
-    <w:p>
-      <w:r>
-        <w:t>one book.</w:t>
-      </w:r>
-    </w:p>
-    <w:p>
-      <w:r>
-        <w:t>Q26) Write an SQL query to display member ID with highest and lowest number of books</w:t>
-      </w:r>
-    </w:p>
-    <w:p>
-      <w:r>
-        <w:t>issued.</w:t>
-      </w:r>
-    </w:p>
-    <w:p>
-      <w:r>
-        <w:t>Q27) Write an SQL query to list issue details for books issued in December or July.</w:t>
-      </w:r>
-    </w:p>
-    <w:p>
-      <w:r>
-        <w:t xml:space="preserve">Q28) Write an SQL query to display </w:t>
-      </w:r>
-      <w:proofErr w:type="spellStart"/>
-      <w:r>
-        <w:t>Book_No</w:t>
-      </w:r>
-      <w:proofErr w:type="spellEnd"/>
-      <w:r>
-        <w:t xml:space="preserve">, </w:t>
-      </w:r>
-      <w:proofErr w:type="spellStart"/>
-      <w:r>
-        <w:t>Book_Name</w:t>
-      </w:r>
-      <w:proofErr w:type="spellEnd"/>
-      <w:r>
-        <w:t xml:space="preserve"> and </w:t>
-      </w:r>
-      <w:proofErr w:type="spellStart"/>
-      <w:r>
-        <w:t>Issue_Date</w:t>
-      </w:r>
-      <w:proofErr w:type="spellEnd"/>
-      <w:r>
-        <w:t xml:space="preserve"> for books issued in</w:t>
-      </w:r>
-    </w:p>
-    <w:p>
-      <w:r>
-        <w:t>December and belonging to category Database.</w:t>
-      </w:r>
-    </w:p>
-    <w:p>
-      <w:r>
-        <w:t xml:space="preserve">Q29) Write an SQL query to display </w:t>
-      </w:r>
-      <w:proofErr w:type="spellStart"/>
-      <w:r>
-        <w:t>Member_Id</w:t>
-      </w:r>
-      <w:proofErr w:type="spellEnd"/>
-      <w:r>
-        <w:t xml:space="preserve">, </w:t>
-      </w:r>
-      <w:proofErr w:type="spellStart"/>
-      <w:r>
-        <w:t>Member_Name</w:t>
-      </w:r>
-      <w:proofErr w:type="spellEnd"/>
-      <w:r>
-        <w:t xml:space="preserve"> and </w:t>
-      </w:r>
-      <w:proofErr w:type="spellStart"/>
-      <w:r>
-        <w:t>Max_Books_Allowed</w:t>
-      </w:r>
-      <w:proofErr w:type="spellEnd"/>
-    </w:p>
-    <w:p>
-      <w:r>
-        <w:t xml:space="preserve">sorted by </w:t>
-      </w:r>
-      <w:proofErr w:type="spellStart"/>
-      <w:r>
-        <w:t>Max_Books_Allowed</w:t>
-      </w:r>
-      <w:proofErr w:type="spellEnd"/>
-      <w:r>
-        <w:t xml:space="preserve"> descending.</w:t>
-      </w:r>
-    </w:p>
-    <w:p>
-      <w:r>
-        <w:t xml:space="preserve">Q30) Write an SQL query to list </w:t>
-      </w:r>
-      <w:proofErr w:type="spellStart"/>
-      <w:r>
-        <w:t>Book_No</w:t>
-      </w:r>
-      <w:proofErr w:type="spellEnd"/>
-      <w:r>
-        <w:t xml:space="preserve">, </w:t>
-      </w:r>
-      <w:proofErr w:type="spellStart"/>
-      <w:r>
-        <w:t>Book_Name</w:t>
-      </w:r>
-      <w:proofErr w:type="spellEnd"/>
-      <w:r>
-        <w:t xml:space="preserve">, </w:t>
-      </w:r>
-      <w:proofErr w:type="spellStart"/>
-      <w:r>
-        <w:t>Issue_Date</w:t>
-      </w:r>
-      <w:proofErr w:type="spellEnd"/>
-      <w:r>
-        <w:t xml:space="preserve"> and </w:t>
-      </w:r>
-      <w:proofErr w:type="spellStart"/>
-      <w:r>
-        <w:t>Return_Date</w:t>
-      </w:r>
-      <w:proofErr w:type="spellEnd"/>
-      <w:r>
-        <w:t xml:space="preserve"> for all</w:t>
-      </w:r>
-    </w:p>
-    <w:p>
-      <w:r>
-        <w:t>books issued by member 'Richa Sharma'.</w:t>
-      </w:r>
-    </w:p>
-    <w:p/>
-    <w:p>
-      <w:r>
-        <w:t>Q31) Write an SQL query to list details of members who have issued books in Database</w:t>
-      </w:r>
-    </w:p>
-    <w:p>
-      <w:r>
-        <w:t>category.</w:t>
-      </w:r>
-    </w:p>
-    <w:p>
-      <w:r>
-        <w:t>Q32) Write an SQL query to list books having the highest price in each category.</w:t>
-      </w:r>
-    </w:p>
-    <w:p>
-      <w:r>
-        <w:t xml:space="preserve">Q33) Write an SQL query to list issue details where </w:t>
-      </w:r>
-      <w:proofErr w:type="spellStart"/>
-      <w:r>
-        <w:t>issue_date</w:t>
-      </w:r>
-      <w:proofErr w:type="spellEnd"/>
-      <w:r>
-        <w:t xml:space="preserve"> is outside the membership period</w:t>
-      </w:r>
-    </w:p>
-    <w:p>
-      <w:r>
-        <w:t>of that member.</w:t>
-      </w:r>
-    </w:p>
-    <w:p>
-      <w:r>
-        <w:t>Q34) Write an SQL query to list members who have not issued any book so far.</w:t>
-      </w:r>
-    </w:p>
-    <w:p>
-      <w:r>
-        <w:t>Q35) Write an SQL query to list members who have issued the same book as issued by 'Garima</w:t>
-      </w:r>
-    </w:p>
-    <w:p>
-      <w:r>
-        <w:t>Sen'.</w:t>
-      </w:r>
-    </w:p>
-    <w:p>
-      <w:r>
-        <w:t>Q36) Write an SQL query to list book name and price of books not returned for more than 30</w:t>
-      </w:r>
-    </w:p>
-    <w:p>
-      <w:r>
-        <w:t>days.</w:t>
-      </w:r>
-    </w:p>
-    <w:p>
-      <w:r>
-        <w:t>Q37) Write an SQL query to list authors who have written more than one book.</w:t>
-      </w:r>
-    </w:p>
-    <w:p>
-      <w:r>
-        <w:t>Q38) Write an SQL query to display member(s) who issued the maximum and minimum number</w:t>
-      </w:r>
-    </w:p>
-    <w:p>
-      <w:r>
-        <w:t>of books.</w:t>
-      </w:r>
-    </w:p>
-    <w:p>
-      <w:r>
-        <w:t>Q39) Write an SQL query to list details of top 3 highest priced books.</w:t>
-      </w:r>
-    </w:p>
-    <w:p>
-      <w:r>
-        <w:t>Q40) Write an SQL query to calculate total cost of books currently issued but not returned.</w:t>
-      </w:r>
-    </w:p>
-    <w:p>
-      <w:r>
-        <w:t>Q41) Write an SQL query to display the book issued maximum number of times.</w:t>
-      </w:r>
-    </w:p>
-    <w:p>
-      <w:r>
-        <w:t>Q42) Write an SQL query to count how many books are issued to Lifetime members.</w:t>
-      </w:r>
-    </w:p>
-    <w:p>
-      <w:r>
-        <w:t>Q43) Write an SQL query to display each membership type and number of members in that type.</w:t>
-      </w:r>
-    </w:p>
-    <w:p>
-      <w:r>
-        <w:lastRenderedPageBreak/>
-        <w:t>Q44) Write an SQL query to list first 5 members who joined the library.</w:t>
-      </w:r>
-    </w:p>
-    <w:p>
-      <w:r>
-        <w:t>Q45) Write an SQL query to list members (with membership type) who issued books during</w:t>
-      </w:r>
-    </w:p>
-    <w:p>
-      <w:r>
-        <w:t>December month.</w:t>
-      </w:r>
-    </w:p>
-    <w:p>
-      <w:r>
-        <w:t>Q46) Write an SQL query to list members who have not returned books yet.</w:t>
-      </w:r>
-    </w:p>
-    <w:p/>
-    <w:p>
-      <w:r>
-        <w:t>Q47) Write an SQL query to list members who joined on the same date as 'Garima Sen'.</w:t>
-      </w:r>
-    </w:p>
-    <w:p>
-      <w:r>
-        <w:t>Q48) Write an SQL query to list members who issued books written by author '</w:t>
-      </w:r>
-      <w:proofErr w:type="spellStart"/>
-      <w:r>
-        <w:t>Loni</w:t>
-      </w:r>
-      <w:proofErr w:type="spellEnd"/>
-      <w:r>
-        <w:t>' in</w:t>
-      </w:r>
-    </w:p>
-    <w:p>
-      <w:r>
-        <w:t>December.</w:t>
-      </w:r>
-    </w:p>
-    <w:p>
-      <w:r>
         <w:t>Q49) Write an SQL query to list authors whose books are least issued by Lifetime members.</w:t>
       </w:r>
     </w:p>

</xml_diff>

<commit_message>
sorting algorithm questions are done
</commit_message>
<xml_diff>
--- a/MYSQL/Assignments/05_Assignment.docx
+++ b/MYSQL/Assignments/05_Assignment.docx
@@ -187,6 +187,9 @@
     </w:p>
     <w:p>
       <w:r>
+        <w:rPr>
+          <w:noProof/>
+        </w:rPr>
         <w:drawing>
           <wp:inline distT="0" distB="0" distL="0" distR="0" wp14:anchorId="33018D46" wp14:editId="1B9B7F5A">
             <wp:extent cx="5731510" cy="1873250"/>
@@ -240,6 +243,9 @@
     </w:p>
     <w:p>
       <w:r>
+        <w:rPr>
+          <w:noProof/>
+        </w:rPr>
         <w:drawing>
           <wp:inline distT="0" distB="0" distL="0" distR="0" wp14:anchorId="2DA581C1" wp14:editId="49F68F0B">
             <wp:extent cx="5731510" cy="1547446"/>
@@ -289,6 +295,9 @@
     </w:p>
     <w:p>
       <w:r>
+        <w:rPr>
+          <w:noProof/>
+        </w:rPr>
         <w:drawing>
           <wp:inline distT="0" distB="0" distL="0" distR="0" wp14:anchorId="2D2BF08B" wp14:editId="36DA2E95">
             <wp:extent cx="5731510" cy="1448973"/>
@@ -333,6 +342,9 @@
     </w:p>
     <w:p>
       <w:r>
+        <w:rPr>
+          <w:noProof/>
+        </w:rPr>
         <w:drawing>
           <wp:inline distT="0" distB="0" distL="0" distR="0" wp14:anchorId="5CACFBFA" wp14:editId="3E64165D">
             <wp:extent cx="5731510" cy="1667022"/>
@@ -377,6 +389,9 @@
     </w:p>
     <w:p>
       <w:r>
+        <w:rPr>
+          <w:noProof/>
+        </w:rPr>
         <w:drawing>
           <wp:inline distT="0" distB="0" distL="0" distR="0" wp14:anchorId="7B1B9AB8" wp14:editId="232ECC12">
             <wp:extent cx="5730092" cy="2089052"/>
@@ -422,6 +437,9 @@
     </w:p>
     <w:p>
       <w:r>
+        <w:rPr>
+          <w:noProof/>
+        </w:rPr>
         <w:drawing>
           <wp:inline distT="0" distB="0" distL="0" distR="0" wp14:anchorId="577DB6D9" wp14:editId="615E0C17">
             <wp:extent cx="5731510" cy="1955409"/>
@@ -466,6 +484,9 @@
     </w:p>
     <w:p>
       <w:r>
+        <w:rPr>
+          <w:noProof/>
+        </w:rPr>
         <w:drawing>
           <wp:inline distT="0" distB="0" distL="0" distR="0" wp14:anchorId="0F8BD14E" wp14:editId="78697621">
             <wp:extent cx="5731510" cy="1596390"/>
@@ -539,6 +560,9 @@
     </w:p>
     <w:p>
       <w:r>
+        <w:rPr>
+          <w:noProof/>
+        </w:rPr>
         <w:drawing>
           <wp:inline distT="0" distB="0" distL="0" distR="0" wp14:anchorId="77A4DD88" wp14:editId="44805DFB">
             <wp:extent cx="5731055" cy="1885071"/>
@@ -583,6 +607,9 @@
     </w:p>
     <w:p>
       <w:r>
+        <w:rPr>
+          <w:noProof/>
+        </w:rPr>
         <w:drawing>
           <wp:inline distT="0" distB="0" distL="0" distR="0" wp14:anchorId="41BC27BE" wp14:editId="0F6CA07E">
             <wp:extent cx="5731510" cy="1498209"/>
@@ -628,6 +655,9 @@
     </w:p>
     <w:p>
       <w:r>
+        <w:rPr>
+          <w:noProof/>
+        </w:rPr>
         <w:drawing>
           <wp:inline distT="0" distB="0" distL="0" distR="0" wp14:anchorId="659DB06F" wp14:editId="312DE8C1">
             <wp:extent cx="5731510" cy="1532255"/>
@@ -672,6 +702,9 @@
     </w:p>
     <w:p>
       <w:r>
+        <w:rPr>
+          <w:noProof/>
+        </w:rPr>
         <w:drawing>
           <wp:inline distT="0" distB="0" distL="0" distR="0" wp14:anchorId="6A7F41F0" wp14:editId="5FC750DF">
             <wp:extent cx="5731510" cy="1258570"/>
@@ -716,6 +749,9 @@
     </w:p>
     <w:p>
       <w:r>
+        <w:rPr>
+          <w:noProof/>
+        </w:rPr>
         <w:drawing>
           <wp:inline distT="0" distB="0" distL="0" distR="0" wp14:anchorId="5F160D6A" wp14:editId="7F60B879">
             <wp:extent cx="5731510" cy="1294130"/>
@@ -760,6 +796,9 @@
     </w:p>
     <w:p>
       <w:r>
+        <w:rPr>
+          <w:noProof/>
+        </w:rPr>
         <w:drawing>
           <wp:inline distT="0" distB="0" distL="0" distR="0" wp14:anchorId="6E518381" wp14:editId="6CD68681">
             <wp:extent cx="5731510" cy="1329690"/>
@@ -804,6 +843,9 @@
     </w:p>
     <w:p>
       <w:r>
+        <w:rPr>
+          <w:noProof/>
+        </w:rPr>
         <w:drawing>
           <wp:inline distT="0" distB="0" distL="0" distR="0" wp14:anchorId="50EA5E7D" wp14:editId="536285EA">
             <wp:extent cx="5731510" cy="1453515"/>
@@ -849,6 +891,9 @@
     </w:p>
     <w:p>
       <w:r>
+        <w:rPr>
+          <w:noProof/>
+        </w:rPr>
         <w:drawing>
           <wp:inline distT="0" distB="0" distL="0" distR="0" wp14:anchorId="0876EA17" wp14:editId="6839E0A0">
             <wp:extent cx="5731510" cy="1652954"/>
@@ -906,6 +951,9 @@
     </w:p>
     <w:p>
       <w:r>
+        <w:rPr>
+          <w:noProof/>
+        </w:rPr>
         <w:drawing>
           <wp:inline distT="0" distB="0" distL="0" distR="0" wp14:anchorId="0E2368F7" wp14:editId="5A7C695F">
             <wp:extent cx="5731174" cy="2229730"/>
@@ -955,6 +1003,9 @@
     </w:p>
     <w:p>
       <w:r>
+        <w:rPr>
+          <w:noProof/>
+        </w:rPr>
         <w:drawing>
           <wp:inline distT="0" distB="0" distL="0" distR="0" wp14:anchorId="27F7A143" wp14:editId="5AA463D2">
             <wp:extent cx="5729339" cy="1603717"/>
@@ -999,6 +1050,9 @@
     </w:p>
     <w:p>
       <w:r>
+        <w:rPr>
+          <w:noProof/>
+        </w:rPr>
         <w:drawing>
           <wp:inline distT="0" distB="0" distL="0" distR="0" wp14:anchorId="6C78737D" wp14:editId="7B8A465D">
             <wp:extent cx="5729753" cy="1280160"/>
@@ -1065,10 +1119,13 @@
     </w:p>
     <w:p>
       <w:r>
-        <w:drawing>
-          <wp:inline distT="0" distB="0" distL="0" distR="0" wp14:anchorId="3CA83471" wp14:editId="51BB8025">
-            <wp:extent cx="5731510" cy="2089150"/>
-            <wp:effectExtent l="0" t="0" r="2540" b="6350"/>
+        <w:rPr>
+          <w:noProof/>
+        </w:rPr>
+        <w:drawing>
+          <wp:inline distT="0" distB="0" distL="0" distR="0" wp14:anchorId="3CA83471" wp14:editId="50564E6E">
+            <wp:extent cx="5731510" cy="1709224"/>
+            <wp:effectExtent l="0" t="0" r="2540" b="5715"/>
             <wp:docPr id="22" name="Picture 22"/>
             <wp:cNvGraphicFramePr>
               <a:graphicFrameLocks xmlns:a="http://schemas.openxmlformats.org/drawingml/2006/main" noChangeAspect="1"/>
@@ -1089,7 +1146,7 @@
                   <pic:spPr>
                     <a:xfrm>
                       <a:off x="0" y="0"/>
-                      <a:ext cx="5731510" cy="2089150"/>
+                      <a:ext cx="5732982" cy="1709663"/>
                     </a:xfrm>
                     <a:prstGeom prst="rect">
                       <a:avLst/>
@@ -1113,374 +1170,539 @@
       </w:r>
     </w:p>
     <w:p>
+      <w:r>
+        <w:rPr>
+          <w:noProof/>
+        </w:rPr>
+        <w:drawing>
+          <wp:inline distT="0" distB="0" distL="0" distR="0" wp14:anchorId="255BD6AE" wp14:editId="6BA086FB">
+            <wp:extent cx="5731510" cy="1793630"/>
+            <wp:effectExtent l="0" t="0" r="2540" b="0"/>
+            <wp:docPr id="23" name="Picture 23"/>
+            <wp:cNvGraphicFramePr>
+              <a:graphicFrameLocks xmlns:a="http://schemas.openxmlformats.org/drawingml/2006/main" noChangeAspect="1"/>
+            </wp:cNvGraphicFramePr>
+            <a:graphic xmlns:a="http://schemas.openxmlformats.org/drawingml/2006/main">
+              <a:graphicData uri="http://schemas.openxmlformats.org/drawingml/2006/picture">
+                <pic:pic xmlns:pic="http://schemas.openxmlformats.org/drawingml/2006/picture">
+                  <pic:nvPicPr>
+                    <pic:cNvPr id="1" name=""/>
+                    <pic:cNvPicPr/>
+                  </pic:nvPicPr>
+                  <pic:blipFill>
+                    <a:blip r:embed="rId26"/>
+                    <a:stretch>
+                      <a:fillRect/>
+                    </a:stretch>
+                  </pic:blipFill>
+                  <pic:spPr>
+                    <a:xfrm>
+                      <a:off x="0" y="0"/>
+                      <a:ext cx="5738433" cy="1795796"/>
+                    </a:xfrm>
+                    <a:prstGeom prst="rect">
+                      <a:avLst/>
+                    </a:prstGeom>
+                  </pic:spPr>
+                </pic:pic>
+              </a:graphicData>
+            </a:graphic>
+          </wp:inline>
+        </w:drawing>
+      </w:r>
+    </w:p>
+    <w:p>
+      <w:r>
+        <w:t>Q24) Write an SQL query to list book numbers of books that have never been issued.</w:t>
+      </w:r>
+    </w:p>
+    <w:p>
+      <w:r>
+        <w:drawing>
+          <wp:inline distT="0" distB="0" distL="0" distR="0" wp14:anchorId="440A8EB7" wp14:editId="0FE0DA01">
+            <wp:extent cx="5731510" cy="1181686"/>
+            <wp:effectExtent l="0" t="0" r="2540" b="0"/>
+            <wp:docPr id="24" name="Picture 24"/>
+            <wp:cNvGraphicFramePr>
+              <a:graphicFrameLocks xmlns:a="http://schemas.openxmlformats.org/drawingml/2006/main" noChangeAspect="1"/>
+            </wp:cNvGraphicFramePr>
+            <a:graphic xmlns:a="http://schemas.openxmlformats.org/drawingml/2006/main">
+              <a:graphicData uri="http://schemas.openxmlformats.org/drawingml/2006/picture">
+                <pic:pic xmlns:pic="http://schemas.openxmlformats.org/drawingml/2006/picture">
+                  <pic:nvPicPr>
+                    <pic:cNvPr id="1" name=""/>
+                    <pic:cNvPicPr/>
+                  </pic:nvPicPr>
+                  <pic:blipFill>
+                    <a:blip r:embed="rId27"/>
+                    <a:stretch>
+                      <a:fillRect/>
+                    </a:stretch>
+                  </pic:blipFill>
+                  <pic:spPr>
+                    <a:xfrm>
+                      <a:off x="0" y="0"/>
+                      <a:ext cx="5742031" cy="1183855"/>
+                    </a:xfrm>
+                    <a:prstGeom prst="rect">
+                      <a:avLst/>
+                    </a:prstGeom>
+                  </pic:spPr>
+                </pic:pic>
+              </a:graphicData>
+            </a:graphic>
+          </wp:inline>
+        </w:drawing>
+      </w:r>
+    </w:p>
+    <w:p>
+      <w:r>
+        <w:t>Q25) Write an SQL query to list member IDs who exist in Member table and have issued at least</w:t>
+      </w:r>
+    </w:p>
+    <w:p>
+      <w:r>
+        <w:t>one book.</w:t>
+      </w:r>
+    </w:p>
+    <w:p>
+      <w:r>
+        <w:drawing>
+          <wp:inline distT="0" distB="0" distL="0" distR="0" wp14:anchorId="7639A0FA" wp14:editId="1BE09475">
+            <wp:extent cx="5731510" cy="1617785"/>
+            <wp:effectExtent l="0" t="0" r="2540" b="1905"/>
+            <wp:docPr id="25" name="Picture 25"/>
+            <wp:cNvGraphicFramePr>
+              <a:graphicFrameLocks xmlns:a="http://schemas.openxmlformats.org/drawingml/2006/main" noChangeAspect="1"/>
+            </wp:cNvGraphicFramePr>
+            <a:graphic xmlns:a="http://schemas.openxmlformats.org/drawingml/2006/main">
+              <a:graphicData uri="http://schemas.openxmlformats.org/drawingml/2006/picture">
+                <pic:pic xmlns:pic="http://schemas.openxmlformats.org/drawingml/2006/picture">
+                  <pic:nvPicPr>
+                    <pic:cNvPr id="1" name=""/>
+                    <pic:cNvPicPr/>
+                  </pic:nvPicPr>
+                  <pic:blipFill>
+                    <a:blip r:embed="rId28"/>
+                    <a:stretch>
+                      <a:fillRect/>
+                    </a:stretch>
+                  </pic:blipFill>
+                  <pic:spPr>
+                    <a:xfrm>
+                      <a:off x="0" y="0"/>
+                      <a:ext cx="5744002" cy="1621311"/>
+                    </a:xfrm>
+                    <a:prstGeom prst="rect">
+                      <a:avLst/>
+                    </a:prstGeom>
+                  </pic:spPr>
+                </pic:pic>
+              </a:graphicData>
+            </a:graphic>
+          </wp:inline>
+        </w:drawing>
+      </w:r>
+    </w:p>
+    <w:p>
+      <w:r>
+        <w:lastRenderedPageBreak/>
+        <w:t>Q26) Write an SQL query to display member ID with highest and lowest number of books</w:t>
+      </w:r>
+    </w:p>
+    <w:p>
+      <w:r>
+        <w:t>issued.</w:t>
+      </w:r>
+    </w:p>
+    <w:p>
+      <w:r>
+        <w:drawing>
+          <wp:inline distT="0" distB="0" distL="0" distR="0" wp14:anchorId="3780D1D8" wp14:editId="01ADAD51">
+            <wp:extent cx="5731510" cy="2010410"/>
+            <wp:effectExtent l="0" t="0" r="2540" b="8890"/>
+            <wp:docPr id="26" name="Picture 26"/>
+            <wp:cNvGraphicFramePr>
+              <a:graphicFrameLocks xmlns:a="http://schemas.openxmlformats.org/drawingml/2006/main" noChangeAspect="1"/>
+            </wp:cNvGraphicFramePr>
+            <a:graphic xmlns:a="http://schemas.openxmlformats.org/drawingml/2006/main">
+              <a:graphicData uri="http://schemas.openxmlformats.org/drawingml/2006/picture">
+                <pic:pic xmlns:pic="http://schemas.openxmlformats.org/drawingml/2006/picture">
+                  <pic:nvPicPr>
+                    <pic:cNvPr id="1" name=""/>
+                    <pic:cNvPicPr/>
+                  </pic:nvPicPr>
+                  <pic:blipFill>
+                    <a:blip r:embed="rId29"/>
+                    <a:stretch>
+                      <a:fillRect/>
+                    </a:stretch>
+                  </pic:blipFill>
+                  <pic:spPr>
+                    <a:xfrm>
+                      <a:off x="0" y="0"/>
+                      <a:ext cx="5731510" cy="2010410"/>
+                    </a:xfrm>
+                    <a:prstGeom prst="rect">
+                      <a:avLst/>
+                    </a:prstGeom>
+                  </pic:spPr>
+                </pic:pic>
+              </a:graphicData>
+            </a:graphic>
+          </wp:inline>
+        </w:drawing>
+      </w:r>
+      <w:r>
+        <w:rPr>
+          <w:noProof/>
+        </w:rPr>
+        <w:t xml:space="preserve"> </w:t>
+      </w:r>
+      <w:r>
+        <w:drawing>
+          <wp:inline distT="0" distB="0" distL="0" distR="0" wp14:anchorId="625A15AD" wp14:editId="4E8BEB82">
+            <wp:extent cx="5731510" cy="3609340"/>
+            <wp:effectExtent l="0" t="0" r="2540" b="0"/>
+            <wp:docPr id="27" name="Picture 27"/>
+            <wp:cNvGraphicFramePr>
+              <a:graphicFrameLocks xmlns:a="http://schemas.openxmlformats.org/drawingml/2006/main" noChangeAspect="1"/>
+            </wp:cNvGraphicFramePr>
+            <a:graphic xmlns:a="http://schemas.openxmlformats.org/drawingml/2006/main">
+              <a:graphicData uri="http://schemas.openxmlformats.org/drawingml/2006/picture">
+                <pic:pic xmlns:pic="http://schemas.openxmlformats.org/drawingml/2006/picture">
+                  <pic:nvPicPr>
+                    <pic:cNvPr id="1" name=""/>
+                    <pic:cNvPicPr/>
+                  </pic:nvPicPr>
+                  <pic:blipFill>
+                    <a:blip r:embed="rId30"/>
+                    <a:stretch>
+                      <a:fillRect/>
+                    </a:stretch>
+                  </pic:blipFill>
+                  <pic:spPr>
+                    <a:xfrm>
+                      <a:off x="0" y="0"/>
+                      <a:ext cx="5731510" cy="3609340"/>
+                    </a:xfrm>
+                    <a:prstGeom prst="rect">
+                      <a:avLst/>
+                    </a:prstGeom>
+                  </pic:spPr>
+                </pic:pic>
+              </a:graphicData>
+            </a:graphic>
+          </wp:inline>
+        </w:drawing>
+      </w:r>
+    </w:p>
+    <w:p>
+      <w:r>
+        <w:t>Q27) Write an SQL query to l</w:t>
+      </w:r>
       <w:bookmarkStart w:id="0" w:name="_GoBack"/>
-      <w:r>
-        <w:drawing>
-          <wp:inline distT="0" distB="0" distL="0" distR="0" wp14:anchorId="255BD6AE" wp14:editId="001C3C68">
-            <wp:extent cx="5731510" cy="2206625"/>
-            <wp:effectExtent l="0" t="0" r="2540" b="3175"/>
-            <wp:docPr id="23" name="Picture 23"/>
-            <wp:cNvGraphicFramePr>
-              <a:graphicFrameLocks xmlns:a="http://schemas.openxmlformats.org/drawingml/2006/main" noChangeAspect="1"/>
-            </wp:cNvGraphicFramePr>
-            <a:graphic xmlns:a="http://schemas.openxmlformats.org/drawingml/2006/main">
-              <a:graphicData uri="http://schemas.openxmlformats.org/drawingml/2006/picture">
-                <pic:pic xmlns:pic="http://schemas.openxmlformats.org/drawingml/2006/picture">
-                  <pic:nvPicPr>
-                    <pic:cNvPr id="1" name=""/>
-                    <pic:cNvPicPr/>
-                  </pic:nvPicPr>
-                  <pic:blipFill>
-                    <a:blip r:embed="rId26"/>
-                    <a:stretch>
-                      <a:fillRect/>
-                    </a:stretch>
-                  </pic:blipFill>
-                  <pic:spPr>
-                    <a:xfrm>
-                      <a:off x="0" y="0"/>
-                      <a:ext cx="5731510" cy="2206625"/>
-                    </a:xfrm>
-                    <a:prstGeom prst="rect">
-                      <a:avLst/>
-                    </a:prstGeom>
-                  </pic:spPr>
-                </pic:pic>
-              </a:graphicData>
-            </a:graphic>
-          </wp:inline>
-        </w:drawing>
-      </w:r>
       <w:bookmarkEnd w:id="0"/>
-    </w:p>
-    <w:p>
-      <w:r>
-        <w:t>Q24) Write an SQL query to list book numbers of books that have never been issued.</w:t>
+      <w:r>
+        <w:t>ist issue details for books issued in December or July.</w:t>
       </w:r>
     </w:p>
     <w:p/>
     <w:p>
       <w:r>
-        <w:t>Q25) Write an SQL query to list member IDs who exist in Member table and have issued at least</w:t>
-      </w:r>
-    </w:p>
-    <w:p>
-      <w:r>
-        <w:t>one book.</w:t>
+        <w:t xml:space="preserve">Q28) Write an SQL query to display </w:t>
+      </w:r>
+      <w:proofErr w:type="spellStart"/>
+      <w:r>
+        <w:t>Book_No</w:t>
+      </w:r>
+      <w:proofErr w:type="spellEnd"/>
+      <w:r>
+        <w:t xml:space="preserve">, </w:t>
+      </w:r>
+      <w:proofErr w:type="spellStart"/>
+      <w:r>
+        <w:t>Book_Name</w:t>
+      </w:r>
+      <w:proofErr w:type="spellEnd"/>
+      <w:r>
+        <w:t xml:space="preserve"> and </w:t>
+      </w:r>
+      <w:proofErr w:type="spellStart"/>
+      <w:r>
+        <w:t>Issue_Date</w:t>
+      </w:r>
+      <w:proofErr w:type="spellEnd"/>
+      <w:r>
+        <w:t xml:space="preserve"> for books issued in</w:t>
+      </w:r>
+    </w:p>
+    <w:p>
+      <w:r>
+        <w:t>December and belonging to category Database.</w:t>
+      </w:r>
+    </w:p>
+    <w:p>
+      <w:r>
+        <w:t xml:space="preserve">Q29) Write an SQL query to display </w:t>
+      </w:r>
+      <w:proofErr w:type="spellStart"/>
+      <w:r>
+        <w:t>Member_Id</w:t>
+      </w:r>
+      <w:proofErr w:type="spellEnd"/>
+      <w:r>
+        <w:t xml:space="preserve">, </w:t>
+      </w:r>
+      <w:proofErr w:type="spellStart"/>
+      <w:r>
+        <w:t>Member_Name</w:t>
+      </w:r>
+      <w:proofErr w:type="spellEnd"/>
+      <w:r>
+        <w:t xml:space="preserve"> and </w:t>
+      </w:r>
+      <w:proofErr w:type="spellStart"/>
+      <w:r>
+        <w:t>Max_Books_Allowed</w:t>
+      </w:r>
+      <w:proofErr w:type="spellEnd"/>
+    </w:p>
+    <w:p>
+      <w:r>
+        <w:t xml:space="preserve">sorted by </w:t>
+      </w:r>
+      <w:proofErr w:type="spellStart"/>
+      <w:r>
+        <w:t>Max_Books_Allowed</w:t>
+      </w:r>
+      <w:proofErr w:type="spellEnd"/>
+      <w:r>
+        <w:t xml:space="preserve"> descending.</w:t>
+      </w:r>
+    </w:p>
+    <w:p>
+      <w:r>
+        <w:t xml:space="preserve">Q30) Write an SQL query to list </w:t>
+      </w:r>
+      <w:proofErr w:type="spellStart"/>
+      <w:r>
+        <w:t>Book_No</w:t>
+      </w:r>
+      <w:proofErr w:type="spellEnd"/>
+      <w:r>
+        <w:t xml:space="preserve">, </w:t>
+      </w:r>
+      <w:proofErr w:type="spellStart"/>
+      <w:r>
+        <w:t>Book_Name</w:t>
+      </w:r>
+      <w:proofErr w:type="spellEnd"/>
+      <w:r>
+        <w:t xml:space="preserve">, </w:t>
+      </w:r>
+      <w:proofErr w:type="spellStart"/>
+      <w:r>
+        <w:t>Issue_Date</w:t>
+      </w:r>
+      <w:proofErr w:type="spellEnd"/>
+      <w:r>
+        <w:t xml:space="preserve"> and </w:t>
+      </w:r>
+      <w:proofErr w:type="spellStart"/>
+      <w:r>
+        <w:t>Return_Date</w:t>
+      </w:r>
+      <w:proofErr w:type="spellEnd"/>
+      <w:r>
+        <w:t xml:space="preserve"> for all</w:t>
+      </w:r>
+    </w:p>
+    <w:p>
+      <w:r>
+        <w:t>books issued by member 'Richa Sharma'.</w:t>
       </w:r>
     </w:p>
     <w:p/>
     <w:p>
       <w:r>
-        <w:t>Q26) Write an SQL query to display member ID with highest and lowest number of books</w:t>
-      </w:r>
-    </w:p>
-    <w:p>
-      <w:r>
-        <w:t>issued.</w:t>
+        <w:lastRenderedPageBreak/>
+        <w:t>Q31) Write an SQL query to list details of members who have issued books in Database</w:t>
+      </w:r>
+    </w:p>
+    <w:p>
+      <w:r>
+        <w:t>category.</w:t>
+      </w:r>
+    </w:p>
+    <w:p>
+      <w:r>
+        <w:t>Q32) Write an SQL query to list books having the highest price in each category.</w:t>
+      </w:r>
+    </w:p>
+    <w:p>
+      <w:r>
+        <w:t xml:space="preserve">Q33) Write an SQL query to list issue details where </w:t>
+      </w:r>
+      <w:proofErr w:type="spellStart"/>
+      <w:r>
+        <w:t>issue_date</w:t>
+      </w:r>
+      <w:proofErr w:type="spellEnd"/>
+      <w:r>
+        <w:t xml:space="preserve"> is outside the membership period</w:t>
+      </w:r>
+    </w:p>
+    <w:p>
+      <w:r>
+        <w:t>of that member.</w:t>
+      </w:r>
+    </w:p>
+    <w:p>
+      <w:r>
+        <w:t>Q34) Write an SQL query to list members who have not issued any book so far.</w:t>
+      </w:r>
+    </w:p>
+    <w:p>
+      <w:r>
+        <w:t>Q35) Write an SQL query to list members who have issued the same book as issued by 'Garima</w:t>
+      </w:r>
+    </w:p>
+    <w:p>
+      <w:r>
+        <w:t>Sen'.</w:t>
+      </w:r>
+    </w:p>
+    <w:p>
+      <w:r>
+        <w:t>Q36) Write an SQL query to list book name and price of books not returned for more than 30</w:t>
+      </w:r>
+    </w:p>
+    <w:p>
+      <w:r>
+        <w:t>days.</w:t>
+      </w:r>
+    </w:p>
+    <w:p>
+      <w:r>
+        <w:t>Q37) Write an SQL query to list authors who have written more than one book.</w:t>
+      </w:r>
+    </w:p>
+    <w:p>
+      <w:r>
+        <w:t>Q38) Write an SQL query to display member(s) who issued the maximum and minimum number</w:t>
+      </w:r>
+    </w:p>
+    <w:p>
+      <w:r>
+        <w:t>of books.</w:t>
+      </w:r>
+    </w:p>
+    <w:p>
+      <w:r>
+        <w:t>Q39) Write an SQL query to list details of top 3 highest priced books.</w:t>
+      </w:r>
+    </w:p>
+    <w:p>
+      <w:r>
+        <w:t>Q40) Write an SQL query to calculate total cost of books currently issued but not returned.</w:t>
+      </w:r>
+    </w:p>
+    <w:p>
+      <w:r>
+        <w:t>Q41) Write an SQL query to display the book issued maximum number of times.</w:t>
+      </w:r>
+    </w:p>
+    <w:p>
+      <w:r>
+        <w:t>Q42) Write an SQL query to count how many books are issued to Lifetime members.</w:t>
+      </w:r>
+    </w:p>
+    <w:p>
+      <w:r>
+        <w:t>Q43) Write an SQL query to display each membership type and number of members in that type.</w:t>
+      </w:r>
+    </w:p>
+    <w:p>
+      <w:r>
+        <w:t>Q44) Write an SQL query to list first 5 members who joined the library.</w:t>
+      </w:r>
+    </w:p>
+    <w:p>
+      <w:r>
+        <w:t>Q45) Write an SQL query to list members (with membership type) who issued books during</w:t>
+      </w:r>
+    </w:p>
+    <w:p>
+      <w:r>
+        <w:t>December month.</w:t>
+      </w:r>
+    </w:p>
+    <w:p>
+      <w:r>
+        <w:t>Q46) Write an SQL query to list members who have not returned books yet.</w:t>
       </w:r>
     </w:p>
     <w:p/>
     <w:p>
       <w:r>
-        <w:t>Q27) Write an SQL query to list issue details for books issued in December or July.</w:t>
-      </w:r>
-    </w:p>
-    <w:p>
-      <w:r>
-        <w:t xml:space="preserve">Q28) Write an SQL query to display </w:t>
+        <w:t>Q47) Write an SQL query to list members who joined on the same date as 'Garima Sen'.</w:t>
+      </w:r>
+    </w:p>
+    <w:p>
+      <w:r>
+        <w:t>Q48) Write an SQL query to list members who issued books written by author '</w:t>
       </w:r>
       <w:proofErr w:type="spellStart"/>
       <w:r>
-        <w:t>Book_No</w:t>
+        <w:t>Loni</w:t>
       </w:r>
       <w:proofErr w:type="spellEnd"/>
       <w:r>
-        <w:t xml:space="preserve">, </w:t>
+        <w:t>' in</w:t>
+      </w:r>
+    </w:p>
+    <w:p>
+      <w:r>
+        <w:t>December.</w:t>
+      </w:r>
+    </w:p>
+    <w:p>
+      <w:r>
+        <w:t>Q49) Write an SQL query to list authors whose books are least issued by Lifetime members.</w:t>
+      </w:r>
+    </w:p>
+    <w:p>
+      <w:r>
+        <w:t>Q50) Write an SQL query to list members who issued books costing more than 300 and written</w:t>
+      </w:r>
+    </w:p>
+    <w:p>
+      <w:r>
+        <w:t xml:space="preserve">by author 'Scott </w:t>
       </w:r>
       <w:proofErr w:type="spellStart"/>
       <w:r>
-        <w:t>Book_Name</w:t>
+        <w:t>Urman</w:t>
       </w:r>
       <w:proofErr w:type="spellEnd"/>
       <w:r>
-        <w:t xml:space="preserve"> and </w:t>
-      </w:r>
-      <w:proofErr w:type="spellStart"/>
-      <w:r>
-        <w:t>Issue_Date</w:t>
-      </w:r>
-      <w:proofErr w:type="spellEnd"/>
-      <w:r>
-        <w:t xml:space="preserve"> for books issued in</w:t>
-      </w:r>
-    </w:p>
-    <w:p>
-      <w:r>
-        <w:t>December and belonging to category Database.</w:t>
+        <w:t>'.</w:t>
+      </w:r>
+    </w:p>
+    <w:p>
+      <w:r>
+        <w:t>Q51) Write an SQL query to list Lifetime members who joined in year 2006 and issued only one</w:t>
+      </w:r>
+    </w:p>
+    <w:p>
+      <w:r>
+        <w:t>book.</w:t>
       </w:r>
     </w:p>
     <w:p>
       <w:r>
         <w:lastRenderedPageBreak/>
-        <w:t xml:space="preserve">Q29) Write an SQL query to display </w:t>
-      </w:r>
-      <w:proofErr w:type="spellStart"/>
-      <w:r>
-        <w:t>Member_Id</w:t>
-      </w:r>
-      <w:proofErr w:type="spellEnd"/>
-      <w:r>
-        <w:t xml:space="preserve">, </w:t>
-      </w:r>
-      <w:proofErr w:type="spellStart"/>
-      <w:r>
-        <w:t>Member_Name</w:t>
-      </w:r>
-      <w:proofErr w:type="spellEnd"/>
-      <w:r>
-        <w:t xml:space="preserve"> and </w:t>
-      </w:r>
-      <w:proofErr w:type="spellStart"/>
-      <w:r>
-        <w:t>Max_Books_Allowed</w:t>
-      </w:r>
-      <w:proofErr w:type="spellEnd"/>
-    </w:p>
-    <w:p>
-      <w:r>
-        <w:t xml:space="preserve">sorted by </w:t>
-      </w:r>
-      <w:proofErr w:type="spellStart"/>
-      <w:r>
-        <w:t>Max_Books_Allowed</w:t>
-      </w:r>
-      <w:proofErr w:type="spellEnd"/>
-      <w:r>
-        <w:t xml:space="preserve"> descending.</w:t>
-      </w:r>
-    </w:p>
-    <w:p>
-      <w:r>
-        <w:t xml:space="preserve">Q30) Write an SQL query to list </w:t>
-      </w:r>
-      <w:proofErr w:type="spellStart"/>
-      <w:r>
-        <w:t>Book_No</w:t>
-      </w:r>
-      <w:proofErr w:type="spellEnd"/>
-      <w:r>
-        <w:t xml:space="preserve">, </w:t>
-      </w:r>
-      <w:proofErr w:type="spellStart"/>
-      <w:r>
-        <w:t>Book_Name</w:t>
-      </w:r>
-      <w:proofErr w:type="spellEnd"/>
-      <w:r>
-        <w:t xml:space="preserve">, </w:t>
-      </w:r>
-      <w:proofErr w:type="spellStart"/>
-      <w:r>
-        <w:t>Issue_Date</w:t>
-      </w:r>
-      <w:proofErr w:type="spellEnd"/>
-      <w:r>
-        <w:t xml:space="preserve"> and </w:t>
-      </w:r>
-      <w:proofErr w:type="spellStart"/>
-      <w:r>
-        <w:t>Return_Date</w:t>
-      </w:r>
-      <w:proofErr w:type="spellEnd"/>
-      <w:r>
-        <w:t xml:space="preserve"> for all</w:t>
-      </w:r>
-    </w:p>
-    <w:p>
-      <w:r>
-        <w:t>books issued by member 'Richa Sharma'.</w:t>
-      </w:r>
-    </w:p>
-    <w:p/>
-    <w:p>
-      <w:r>
-        <w:t>Q31) Write an SQL query to list details of members who have issued books in Database</w:t>
-      </w:r>
-    </w:p>
-    <w:p>
-      <w:r>
-        <w:t>category.</w:t>
-      </w:r>
-    </w:p>
-    <w:p>
-      <w:r>
-        <w:t>Q32) Write an SQL query to list books having the highest price in each category.</w:t>
-      </w:r>
-    </w:p>
-    <w:p>
-      <w:r>
-        <w:t xml:space="preserve">Q33) Write an SQL query to list issue details where </w:t>
-      </w:r>
-      <w:proofErr w:type="spellStart"/>
-      <w:r>
-        <w:t>issue_date</w:t>
-      </w:r>
-      <w:proofErr w:type="spellEnd"/>
-      <w:r>
-        <w:t xml:space="preserve"> is outside the membership period</w:t>
-      </w:r>
-    </w:p>
-    <w:p>
-      <w:r>
-        <w:t>of that member.</w:t>
-      </w:r>
-    </w:p>
-    <w:p>
-      <w:r>
-        <w:t>Q34) Write an SQL query to list members who have not issued any book so far.</w:t>
-      </w:r>
-    </w:p>
-    <w:p>
-      <w:r>
-        <w:t>Q35) Write an SQL query to list members who have issued the same book as issued by 'Garima</w:t>
-      </w:r>
-    </w:p>
-    <w:p>
-      <w:r>
-        <w:t>Sen'.</w:t>
-      </w:r>
-    </w:p>
-    <w:p>
-      <w:r>
-        <w:t>Q36) Write an SQL query to list book name and price of books not returned for more than 30</w:t>
-      </w:r>
-    </w:p>
-    <w:p>
-      <w:r>
-        <w:t>days.</w:t>
-      </w:r>
-    </w:p>
-    <w:p>
-      <w:r>
-        <w:t>Q37) Write an SQL query to list authors who have written more than one book.</w:t>
-      </w:r>
-    </w:p>
-    <w:p>
-      <w:r>
-        <w:t>Q38) Write an SQL query to display member(s) who issued the maximum and minimum number</w:t>
-      </w:r>
-    </w:p>
-    <w:p>
-      <w:r>
-        <w:t>of books.</w:t>
-      </w:r>
-    </w:p>
-    <w:p>
-      <w:r>
-        <w:t>Q39) Write an SQL query to list details of top 3 highest priced books.</w:t>
-      </w:r>
-    </w:p>
-    <w:p>
-      <w:r>
-        <w:t>Q40) Write an SQL query to calculate total cost of books currently issued but not returned.</w:t>
-      </w:r>
-    </w:p>
-    <w:p>
-      <w:r>
-        <w:t>Q41) Write an SQL query to display the book issued maximum number of times.</w:t>
-      </w:r>
-    </w:p>
-    <w:p>
-      <w:r>
-        <w:t>Q42) Write an SQL query to count how many books are issued to Lifetime members.</w:t>
-      </w:r>
-    </w:p>
-    <w:p>
-      <w:r>
-        <w:t>Q43) Write an SQL query to display each membership type and number of members in that type.</w:t>
-      </w:r>
-    </w:p>
-    <w:p>
-      <w:r>
-        <w:t>Q44) Write an SQL query to list first 5 members who joined the library.</w:t>
-      </w:r>
-    </w:p>
-    <w:p>
-      <w:r>
-        <w:t>Q45) Write an SQL query to list members (with membership type) who issued books during</w:t>
-      </w:r>
-    </w:p>
-    <w:p>
-      <w:r>
-        <w:t>December month.</w:t>
-      </w:r>
-    </w:p>
-    <w:p>
-      <w:r>
-        <w:t>Q46) Write an SQL query to list members who have not returned books yet.</w:t>
-      </w:r>
-    </w:p>
-    <w:p/>
-    <w:p>
-      <w:r>
-        <w:t>Q47) Write an SQL query to list members who joined on the same date as 'Garima Sen'.</w:t>
-      </w:r>
-    </w:p>
-    <w:p>
-      <w:r>
-        <w:t>Q48) Write an SQL query to list members who issued books written by author '</w:t>
-      </w:r>
-      <w:proofErr w:type="spellStart"/>
-      <w:r>
-        <w:t>Loni</w:t>
-      </w:r>
-      <w:proofErr w:type="spellEnd"/>
-      <w:r>
-        <w:t>' in</w:t>
-      </w:r>
-    </w:p>
-    <w:p>
-      <w:r>
-        <w:t>December.</w:t>
-      </w:r>
-    </w:p>
-    <w:p>
-      <w:r>
-        <w:lastRenderedPageBreak/>
-        <w:t>Q49) Write an SQL query to list authors whose books are least issued by Lifetime members.</w:t>
-      </w:r>
-    </w:p>
-    <w:p>
-      <w:r>
-        <w:t>Q50) Write an SQL query to list members who issued books costing more than 300 and written</w:t>
-      </w:r>
-    </w:p>
-    <w:p>
-      <w:r>
-        <w:t xml:space="preserve">by author 'Scott </w:t>
-      </w:r>
-      <w:proofErr w:type="spellStart"/>
-      <w:r>
-        <w:t>Urman</w:t>
-      </w:r>
-      <w:proofErr w:type="spellEnd"/>
-      <w:r>
-        <w:t>'.</w:t>
-      </w:r>
-    </w:p>
-    <w:p>
-      <w:r>
-        <w:t>Q51) Write an SQL query to list Lifetime members who joined in year 2006 and issued only one</w:t>
-      </w:r>
-    </w:p>
-    <w:p>
-      <w:r>
-        <w:t>book.</w:t>
-      </w:r>
-    </w:p>
-    <w:p>
-      <w:r>
         <w:t>Q52) Write an SQL query to update penalty amount of member 'Garima Sen' to 100.</w:t>
       </w:r>
     </w:p>

</xml_diff>